<commit_message>
HOD can access faculty route and can add remarks for sets
</commit_message>
<xml_diff>
--- a/backend/controllers/output_1.docx
+++ b/backend/controllers/output_1.docx
@@ -57,7 +57,7 @@
                       <w:szCs w:val="24"/>
                       <w:u w:val="single"/>
                     </w:rPr>
-                    <w:t xml:space="preserve">CSE316</w:t>
+                    <w:t xml:space="preserve">CSE372</w:t>
                   </w:r>
                   <w:proofErr w:type="spellStart"/>
                   <w:r>
@@ -419,7 +419,7 @@
                       <w:szCs w:val="24"/>
                       <w:u w:val="single"/>
                     </w:rPr>
-                    <w:t xml:space="preserve">Operating System </w:t>
+                    <w:t xml:space="preserve">UI UX Design</w:t>
                   </w:r>
                   <w:proofErr w:type="spellStart"/>
                   <w:r>
@@ -1116,7 +1116,7 @@
                 <w:sz w:val="24"/>
                 <w:szCs w:val="24"/>
               </w:rPr>
-              <w:t xml:space="preserve">This is a test</w:t>
+              <w:t xml:space="preserve">What is Life?</w:t>
             </w:r>
             <w:r>
               <w:rPr>
@@ -1172,6 +1172,182 @@
                 <w:szCs w:val="24"/>
               </w:rPr>
               <w:t xml:space="preserve"> </w:t>
+            </w:r>
+            <w:r>
+              <w:rPr>
+                <w:rStyle w:val="hljs-selector-id"/>
+                <w:rFonts w:ascii="Times New Roman" w:hAnsi="Times New Roman"/>
+                <w:b/>
+                <w:bCs/>
+                <w:sz w:val="24"/>
+                <w:szCs w:val="24"/>
+              </w:rPr>
+              <w:t/>
+            </w:r>
+            <w:r>
+              <w:rPr>
+                <w:rFonts w:ascii="Times New Roman" w:hAnsi="Times New Roman"/>
+                <w:b/>
+                <w:bCs/>
+                <w:sz w:val="24"/>
+                <w:szCs w:val="24"/>
+              </w:rPr>
+              <w:t/>
+            </w:r>
+          </w:p>
+          <w:p>
+            <w:pPr>
+              <w:spacing w:after="0" w:line="240" w:lineRule="auto"/>
+              <w:jc w:val="both"/>
+              <w:rPr>
+                <w:rFonts w:ascii="Times New Roman" w:hAnsi="Times New Roman"/>
+                <w:b/>
+                <w:bCs/>
+                <w:sz w:val="24"/>
+                <w:szCs w:val="24"/>
+              </w:rPr>
+            </w:pPr>
+            <w:r>
+              <w:rPr>
+                <w:rFonts w:ascii="Times New Roman" w:hAnsi="Times New Roman"/>
+                <w:b/>
+                <w:bCs/>
+                <w:sz w:val="24"/>
+                <w:szCs w:val="24"/>
+              </w:rPr>
+              <w:t xml:space="preserve"> A. Test1</w:t>
+            </w:r>
+            <w:r>
+              <w:rPr>
+                <w:rStyle w:val="hljs-selector-id"/>
+                <w:rFonts w:ascii="Times New Roman" w:hAnsi="Times New Roman"/>
+                <w:b/>
+                <w:bCs/>
+                <w:sz w:val="24"/>
+                <w:szCs w:val="24"/>
+              </w:rPr>
+              <w:t/>
+            </w:r>
+            <w:r>
+              <w:rPr>
+                <w:rFonts w:ascii="Times New Roman" w:hAnsi="Times New Roman"/>
+                <w:b/>
+                <w:bCs/>
+                <w:sz w:val="24"/>
+                <w:szCs w:val="24"/>
+              </w:rPr>
+              <w:t/>
+            </w:r>
+          </w:p>
+          <w:p>
+            <w:pPr>
+              <w:spacing w:after="0" w:line="240" w:lineRule="auto"/>
+              <w:jc w:val="both"/>
+              <w:rPr>
+                <w:rFonts w:ascii="Times New Roman" w:hAnsi="Times New Roman"/>
+                <w:b/>
+                <w:bCs/>
+                <w:sz w:val="24"/>
+                <w:szCs w:val="24"/>
+              </w:rPr>
+            </w:pPr>
+            <w:r>
+              <w:rPr>
+                <w:rFonts w:ascii="Times New Roman" w:hAnsi="Times New Roman"/>
+                <w:b/>
+                <w:bCs/>
+                <w:sz w:val="24"/>
+                <w:szCs w:val="24"/>
+              </w:rPr>
+              <w:t xml:space="preserve"> B. Test2</w:t>
+            </w:r>
+            <w:r>
+              <w:rPr>
+                <w:rStyle w:val="hljs-selector-id"/>
+                <w:rFonts w:ascii="Times New Roman" w:hAnsi="Times New Roman"/>
+                <w:b/>
+                <w:bCs/>
+                <w:sz w:val="24"/>
+                <w:szCs w:val="24"/>
+              </w:rPr>
+              <w:t/>
+            </w:r>
+            <w:r>
+              <w:rPr>
+                <w:rFonts w:ascii="Times New Roman" w:hAnsi="Times New Roman"/>
+                <w:b/>
+                <w:bCs/>
+                <w:sz w:val="24"/>
+                <w:szCs w:val="24"/>
+              </w:rPr>
+              <w:t/>
+            </w:r>
+          </w:p>
+          <w:p>
+            <w:pPr>
+              <w:spacing w:after="0" w:line="240" w:lineRule="auto"/>
+              <w:jc w:val="both"/>
+              <w:rPr>
+                <w:rFonts w:ascii="Times New Roman" w:hAnsi="Times New Roman"/>
+                <w:b/>
+                <w:bCs/>
+                <w:sz w:val="24"/>
+                <w:szCs w:val="24"/>
+              </w:rPr>
+            </w:pPr>
+            <w:r>
+              <w:rPr>
+                <w:rFonts w:ascii="Times New Roman" w:hAnsi="Times New Roman"/>
+                <w:b/>
+                <w:bCs/>
+                <w:sz w:val="24"/>
+                <w:szCs w:val="24"/>
+              </w:rPr>
+              <w:t xml:space="preserve"> C. Test3</w:t>
+            </w:r>
+            <w:r>
+              <w:rPr>
+                <w:rStyle w:val="hljs-selector-id"/>
+                <w:rFonts w:ascii="Times New Roman" w:hAnsi="Times New Roman"/>
+                <w:b/>
+                <w:bCs/>
+                <w:sz w:val="24"/>
+                <w:szCs w:val="24"/>
+              </w:rPr>
+              <w:t/>
+            </w:r>
+            <w:r>
+              <w:rPr>
+                <w:rFonts w:ascii="Times New Roman" w:hAnsi="Times New Roman"/>
+                <w:b/>
+                <w:bCs/>
+                <w:sz w:val="24"/>
+                <w:szCs w:val="24"/>
+              </w:rPr>
+              <w:t/>
+            </w:r>
+          </w:p>
+          <w:p>
+            <w:pPr>
+              <w:spacing w:after="0" w:line="240" w:lineRule="auto"/>
+              <w:jc w:val="both"/>
+              <w:rPr>
+                <w:rFonts w:ascii="Times New Roman" w:hAnsi="Times New Roman"/>
+                <w:b/>
+                <w:bCs/>
+                <w:sz w:val="24"/>
+                <w:szCs w:val="24"/>
+              </w:rPr>
+            </w:pPr>
+            <w:r>
+              <w:rPr>
+                <w:rFonts w:ascii="Times New Roman" w:hAnsi="Times New Roman"/>
+                <w:b/>
+                <w:bCs/>
+                <w:sz w:val="24"/>
+                <w:szCs w:val="24"/>
+              </w:rPr>
+              <w:t xml:space="preserve"> D. Test4</w:t>
             </w:r>
           </w:p>
         </w:tc>

</xml_diff>

<commit_message>
Update Random Approve Question
</commit_message>
<xml_diff>
--- a/backend/controllers/output_1.docx
+++ b/backend/controllers/output_1.docx
@@ -57,7 +57,7 @@
                       <w:szCs w:val="24"/>
                       <w:u w:val="single"/>
                     </w:rPr>
-                    <w:t xml:space="preserve">CSE372</w:t>
+                    <w:t xml:space="preserve">CSE531</w:t>
                   </w:r>
                   <w:proofErr w:type="spellStart"/>
                   <w:r>
@@ -131,7 +131,7 @@
                       <w:szCs w:val="24"/>
                       <w:u w:val="single"/>
                     </w:rPr>
-                    <w:t xml:space="preserve">25/07/2024</w:t>
+                    <w:t xml:space="preserve">undefined</w:t>
                   </w:r>
                   <w:proofErr w:type="spellStart"/>
                   <w:r>
@@ -345,7 +345,7 @@
                       <w:szCs w:val="24"/>
                       <w:u w:val="single"/>
                     </w:rPr>
-                    <w:t xml:space="preserve">25/07/2024</w:t>
+                    <w:t xml:space="preserve">undefined</w:t>
                   </w:r>
                   <w:proofErr w:type="spellStart"/>
                   <w:r>
@@ -419,7 +419,7 @@
                       <w:szCs w:val="24"/>
                       <w:u w:val="single"/>
                     </w:rPr>
-                    <w:t xml:space="preserve">UI UX Design</w:t>
+                    <w:t xml:space="preserve">Machine Learning</w:t>
                   </w:r>
                   <w:proofErr w:type="spellStart"/>
                   <w:r>
@@ -564,7 +564,7 @@
                       <w:szCs w:val="24"/>
                       <w:u w:val="single"/>
                     </w:rPr>
-                    <w:t xml:space="preserve">30</w:t>
+                    <w:t xml:space="preserve">undefined</w:t>
                   </w:r>
                   <w:proofErr w:type="spellStart"/>
                   <w:r>
@@ -706,7 +706,7 @@
           <w:szCs w:val="24"/>
           <w:u w:val="single"/>
         </w:rPr>
-        <w:t xml:space="preserve">Subjective</w:t>
+        <w:t xml:space="preserve">undefined</w:t>
       </w:r>
       <w:proofErr w:type="spellStart"/>
       <w:r>
@@ -1116,7 +1116,7 @@
                 <w:sz w:val="24"/>
                 <w:szCs w:val="24"/>
               </w:rPr>
-              <w:t xml:space="preserve">This is a sample question about different text which were available to me.</w:t>
+              <w:t xml:space="preserve">What is UI UX?</w:t>
             </w:r>
             <w:r>
               <w:rPr>
@@ -1307,7 +1307,7 @@
                 <w:sz w:val="24"/>
                 <w:szCs w:val="24"/>
               </w:rPr>
-              <w:t xml:space="preserve"> B. text2</w:t>
+              <w:t xml:space="preserve"> B. Text1</w:t>
             </w:r>
             <w:r>
               <w:rPr>
@@ -1351,7 +1351,7 @@
                 <w:sz w:val="24"/>
                 <w:szCs w:val="24"/>
               </w:rPr>
-              <w:t xml:space="preserve"> C. Text3</w:t>
+              <w:t xml:space="preserve"> C. Text1</w:t>
             </w:r>
             <w:r>
               <w:rPr>
@@ -1395,719 +1395,7 @@
                 <w:sz w:val="24"/>
                 <w:szCs w:val="24"/>
               </w:rPr>
-              <w:t xml:space="preserve"> D. Text4</w:t>
-            </w:r>
-          </w:p>
-        </w:tc>
-        <w:tc>
-          <w:tcPr>
-            <w:tcW w:w="2153" w:type="dxa"/>
-            <w:tcBorders>
-              <w:top w:val="nil"/>
-              <w:bottom w:val="nil"/>
-            </w:tcBorders>
-            <w:shd w:val="clear" w:color="auto" w:fill="auto"/>
-          </w:tcPr>
-          <w:p>
-            <w:pPr>
-              <w:spacing w:after="0" w:line="240" w:lineRule="auto"/>
-              <w:rPr>
-                <w:rFonts w:ascii="Times New Roman" w:hAnsi="Times New Roman"/>
-                <w:sz w:val="24"/>
-                <w:szCs w:val="24"/>
-              </w:rPr>
-            </w:pPr>
-            <w:r>
-              <w:rPr>
-                <w:rFonts w:ascii="Times New Roman" w:hAnsi="Times New Roman"/>
-                <w:b/>
-                <w:bCs/>
-                <w:sz w:val="24"/>
-                <w:szCs w:val="24"/>
-              </w:rPr>
-              <w:t xml:space="preserve">CO1</w:t>
-            </w:r>
-            <w:proofErr w:type="spellStart"/>
-            <w:r>
-              <w:rPr>
-                <w:rFonts w:ascii="Times New Roman" w:hAnsi="Times New Roman"/>
-                <w:b/>
-                <w:bCs/>
-                <w:sz w:val="24"/>
-                <w:szCs w:val="24"/>
-              </w:rPr>
-              <w:t/>
-            </w:r>
-            <w:proofErr w:type="spellEnd"/>
-            <w:r>
-              <w:rPr>
-                <w:rFonts w:ascii="Times New Roman" w:hAnsi="Times New Roman"/>
-                <w:b/>
-                <w:bCs/>
-                <w:sz w:val="24"/>
-                <w:szCs w:val="24"/>
-              </w:rPr>
-              <w:t/>
-            </w:r>
-          </w:p>
-        </w:tc>
-        <w:tc>
-          <w:tcPr>
-            <w:tcW w:w="1787" w:type="dxa"/>
-            <w:tcBorders>
-              <w:top w:val="nil"/>
-              <w:bottom w:val="nil"/>
-            </w:tcBorders>
-            <w:shd w:val="clear" w:color="auto" w:fill="auto"/>
-          </w:tcPr>
-          <w:p>
-            <w:pPr>
-              <w:spacing w:after="0" w:line="240" w:lineRule="auto"/>
-              <w:rPr>
-                <w:rFonts w:ascii="Times New Roman" w:hAnsi="Times New Roman"/>
-                <w:b/>
-                <w:bCs/>
-                <w:sz w:val="24"/>
-                <w:szCs w:val="24"/>
-              </w:rPr>
-            </w:pPr>
-            <w:r>
-              <w:rPr>
-                <w:rFonts w:ascii="Times New Roman" w:hAnsi="Times New Roman"/>
-                <w:b/>
-                <w:bCs/>
-                <w:sz w:val="24"/>
-                <w:szCs w:val="24"/>
-              </w:rPr>
-              <w:t xml:space="preserve">L1</w:t>
-            </w:r>
-            <w:proofErr w:type="spellStart"/>
-            <w:r>
-              <w:rPr>
-                <w:rFonts w:ascii="Times New Roman" w:hAnsi="Times New Roman"/>
-                <w:b/>
-                <w:bCs/>
-                <w:sz w:val="24"/>
-                <w:szCs w:val="24"/>
-              </w:rPr>
-              <w:t/>
-            </w:r>
-            <w:proofErr w:type="spellEnd"/>
-            <w:r>
-              <w:rPr>
-                <w:rFonts w:ascii="Times New Roman" w:hAnsi="Times New Roman"/>
-                <w:b/>
-                <w:bCs/>
-                <w:sz w:val="24"/>
-                <w:szCs w:val="24"/>
-              </w:rPr>
-              <w:t/>
-            </w:r>
-          </w:p>
-        </w:tc>
-        <w:tc>
-          <w:tcPr>
-            <w:tcW w:w="2155" w:type="dxa"/>
-            <w:tcBorders>
-              <w:top w:val="nil"/>
-              <w:bottom w:val="nil"/>
-            </w:tcBorders>
-            <w:shd w:val="clear" w:color="auto" w:fill="auto"/>
-          </w:tcPr>
-          <w:p>
-            <w:pPr>
-              <w:spacing w:after="0" w:line="240" w:lineRule="auto"/>
-              <w:rPr>
-                <w:rFonts w:ascii="Times New Roman" w:hAnsi="Times New Roman"/>
-                <w:sz w:val="24"/>
-                <w:szCs w:val="24"/>
-              </w:rPr>
-            </w:pPr>
-            <w:r>
-              <w:rPr>
-                <w:rFonts w:ascii="Times New Roman" w:hAnsi="Times New Roman"/>
-                <w:sz w:val="24"/>
-                <w:szCs w:val="24"/>
-              </w:rPr>
-              <w:t xml:space="preserve">         </w:t>
-            </w:r>
-            <w:r>
-              <w:rPr>
-                <w:rFonts w:ascii="Times New Roman" w:hAnsi="Times New Roman"/>
-                <w:b/>
-                <w:bCs/>
-                <w:sz w:val="24"/>
-                <w:szCs w:val="24"/>
-              </w:rPr>
-              <w:t xml:space="preserve">5</w:t>
-            </w:r>
-          </w:p>
-        </w:tc>
-      </w:tr>
-      <w:tr>
-        <w:trPr>
-          <w:trHeight w:val="80"/>
-        </w:trPr>
-        <w:tc>
-          <w:tcPr>
-            <w:tcW w:w="1137" w:type="dxa"/>
-            <w:tcBorders>
-              <w:top w:val="nil"/>
-            </w:tcBorders>
-            <w:shd w:val="clear" w:color="auto" w:fill="auto"/>
-          </w:tcPr>
-          <w:p>
-            <w:pPr>
-              <w:spacing w:after="0" w:line="240" w:lineRule="auto"/>
-              <w:rPr>
-                <w:rFonts w:ascii="Times New Roman" w:hAnsi="Times New Roman"/>
-                <w:sz w:val="24"/>
-                <w:szCs w:val="24"/>
-              </w:rPr>
-            </w:pPr>
-            <w:r>
-              <w:rPr>
-                <w:rFonts w:ascii="Times New Roman" w:hAnsi="Times New Roman"/>
-                <w:sz w:val="24"/>
-                <w:szCs w:val="24"/>
-              </w:rPr>
-              <w:t/>
-            </w:r>
-          </w:p>
-        </w:tc>
-        <w:tc>
-          <w:tcPr>
-            <w:tcW w:w="5718" w:type="dxa"/>
-            <w:tcBorders>
-              <w:top w:val="nil"/>
-            </w:tcBorders>
-            <w:shd w:val="clear" w:color="auto" w:fill="auto"/>
-          </w:tcPr>
-          <w:p>
-            <w:pPr>
-              <w:spacing w:after="0" w:line="240" w:lineRule="auto"/>
-              <w:jc w:val="right"/>
-              <w:rPr>
-                <w:rFonts w:ascii="Times New Roman" w:hAnsi="Times New Roman"/>
-                <w:sz w:val="24"/>
-                <w:szCs w:val="24"/>
-              </w:rPr>
-            </w:pPr>
-          </w:p>
-        </w:tc>
-        <w:tc>
-          <w:tcPr>
-            <w:tcW w:w="2153" w:type="dxa"/>
-            <w:tcBorders>
-              <w:top w:val="nil"/>
-            </w:tcBorders>
-            <w:shd w:val="clear" w:color="auto" w:fill="auto"/>
-          </w:tcPr>
-          <w:p>
-            <w:pPr>
-              <w:spacing w:after="0" w:line="240" w:lineRule="auto"/>
-              <w:rPr>
-                <w:rFonts w:ascii="Times New Roman" w:hAnsi="Times New Roman"/>
-                <w:sz w:val="24"/>
-                <w:szCs w:val="24"/>
-              </w:rPr>
-            </w:pPr>
-          </w:p>
-        </w:tc>
-        <w:tc>
-          <w:tcPr>
-            <w:tcW w:w="1787" w:type="dxa"/>
-            <w:tcBorders>
-              <w:top w:val="nil"/>
-            </w:tcBorders>
-            <w:shd w:val="clear" w:color="auto" w:fill="auto"/>
-          </w:tcPr>
-          <w:p>
-            <w:pPr>
-              <w:spacing w:after="0" w:line="240" w:lineRule="auto"/>
-              <w:rPr>
-                <w:rFonts w:ascii="Times New Roman" w:hAnsi="Times New Roman"/>
-                <w:sz w:val="24"/>
-                <w:szCs w:val="24"/>
-              </w:rPr>
-            </w:pPr>
-          </w:p>
-        </w:tc>
-        <w:tc>
-          <w:tcPr>
-            <w:tcW w:w="2155" w:type="dxa"/>
-            <w:tcBorders>
-              <w:top w:val="nil"/>
-            </w:tcBorders>
-            <w:shd w:val="clear" w:color="auto" w:fill="auto"/>
-          </w:tcPr>
-          <w:p>
-            <w:pPr>
-              <w:spacing w:after="0" w:line="240" w:lineRule="auto"/>
-              <w:rPr>
-                <w:rFonts w:ascii="Times New Roman" w:hAnsi="Times New Roman"/>
-                <w:sz w:val="24"/>
-                <w:szCs w:val="24"/>
-              </w:rPr>
-            </w:pPr>
-          </w:p>
-        </w:tc>
-      </w:tr>
-      <w:tr>
-        <w:trPr>
-          <w:trHeight w:val="82"/>
-        </w:trPr>
-        <w:tc>
-          <w:tcPr>
-            <w:tcW w:w="1137" w:type="dxa"/>
-            <w:tcBorders>
-              <w:bottom w:val="nil"/>
-            </w:tcBorders>
-            <w:shd w:val="clear" w:color="auto" w:fill="auto"/>
-          </w:tcPr>
-          <w:p>
-            <w:pPr>
-              <w:spacing w:after="0" w:line="240" w:lineRule="auto"/>
-              <w:rPr>
-                <w:rFonts w:ascii="Times New Roman" w:hAnsi="Times New Roman"/>
-                <w:sz w:val="24"/>
-                <w:szCs w:val="24"/>
-              </w:rPr>
-            </w:pPr>
-            <w:r>
-              <w:rPr>
-                <w:rFonts w:ascii="Times New Roman" w:hAnsi="Times New Roman"/>
-                <w:sz w:val="24"/>
-                <w:szCs w:val="24"/>
-              </w:rPr>
-              <w:t/>
-            </w:r>
-          </w:p>
-        </w:tc>
-        <w:tc>
-          <w:tcPr>
-            <w:tcW w:w="5718" w:type="dxa"/>
-            <w:tcBorders>
-              <w:bottom w:val="nil"/>
-            </w:tcBorders>
-            <w:shd w:val="clear" w:color="auto" w:fill="auto"/>
-          </w:tcPr>
-          <w:p>
-            <w:pPr>
-              <w:spacing w:after="0" w:line="240" w:lineRule="auto"/>
-              <w:jc w:val="right"/>
-              <w:rPr>
-                <w:rFonts w:ascii="Times New Roman" w:hAnsi="Times New Roman"/>
-                <w:sz w:val="24"/>
-                <w:szCs w:val="24"/>
-              </w:rPr>
-            </w:pPr>
-          </w:p>
-        </w:tc>
-        <w:tc>
-          <w:tcPr>
-            <w:tcW w:w="2153" w:type="dxa"/>
-            <w:tcBorders>
-              <w:bottom w:val="nil"/>
-            </w:tcBorders>
-            <w:shd w:val="clear" w:color="auto" w:fill="auto"/>
-          </w:tcPr>
-          <w:p>
-            <w:pPr>
-              <w:spacing w:after="0" w:line="240" w:lineRule="auto"/>
-              <w:rPr>
-                <w:rFonts w:ascii="Times New Roman" w:hAnsi="Times New Roman"/>
-                <w:sz w:val="24"/>
-                <w:szCs w:val="24"/>
-              </w:rPr>
-            </w:pPr>
-          </w:p>
-        </w:tc>
-        <w:tc>
-          <w:tcPr>
-            <w:tcW w:w="1787" w:type="dxa"/>
-            <w:tcBorders>
-              <w:bottom w:val="nil"/>
-            </w:tcBorders>
-            <w:shd w:val="clear" w:color="auto" w:fill="auto"/>
-          </w:tcPr>
-          <w:p>
-            <w:pPr>
-              <w:spacing w:after="0" w:line="240" w:lineRule="auto"/>
-              <w:rPr>
-                <w:rFonts w:ascii="Times New Roman" w:hAnsi="Times New Roman"/>
-                <w:sz w:val="24"/>
-                <w:szCs w:val="24"/>
-              </w:rPr>
-            </w:pPr>
-          </w:p>
-        </w:tc>
-        <w:tc>
-          <w:tcPr>
-            <w:tcW w:w="2155" w:type="dxa"/>
-            <w:tcBorders>
-              <w:bottom w:val="nil"/>
-            </w:tcBorders>
-            <w:shd w:val="clear" w:color="auto" w:fill="auto"/>
-          </w:tcPr>
-          <w:p>
-            <w:pPr>
-              <w:spacing w:after="0" w:line="240" w:lineRule="auto"/>
-              <w:rPr>
-                <w:rFonts w:ascii="Times New Roman" w:hAnsi="Times New Roman"/>
-                <w:sz w:val="24"/>
-                <w:szCs w:val="24"/>
-              </w:rPr>
-            </w:pPr>
-          </w:p>
-        </w:tc>
-      </w:tr>
-      <w:tr>
-        <w:trPr>
-          <w:trHeight w:val="74"/>
-        </w:trPr>
-        <w:tc>
-          <w:tcPr>
-            <w:tcW w:w="1137" w:type="dxa"/>
-            <w:tcBorders>
-              <w:top w:val="nil"/>
-              <w:bottom w:val="nil"/>
-            </w:tcBorders>
-            <w:shd w:val="clear" w:color="auto" w:fill="auto"/>
-          </w:tcPr>
-          <w:p>
-            <w:pPr>
-              <w:spacing w:after="0" w:line="240" w:lineRule="auto"/>
-              <w:rPr>
-                <w:rFonts w:ascii="Times New Roman" w:hAnsi="Times New Roman"/>
-                <w:b/>
-                <w:bCs/>
-                <w:sz w:val="24"/>
-                <w:szCs w:val="24"/>
-              </w:rPr>
-            </w:pPr>
-            <w:r>
-              <w:rPr>
-                <w:rFonts w:ascii="Times New Roman" w:hAnsi="Times New Roman"/>
-                <w:b/>
-                <w:bCs/>
-                <w:sz w:val="24"/>
-                <w:szCs w:val="24"/>
-              </w:rPr>
-              <w:t xml:space="preserve">2</w:t>
-            </w:r>
-          </w:p>
-        </w:tc>
-        <w:tc>
-          <w:tcPr>
-            <w:tcW w:w="5718" w:type="dxa"/>
-            <w:tcBorders>
-              <w:top w:val="nil"/>
-              <w:bottom w:val="nil"/>
-            </w:tcBorders>
-            <w:shd w:val="clear" w:color="auto" w:fill="auto"/>
-          </w:tcPr>
-          <w:p>
-            <w:pPr>
-              <w:spacing w:after="0" w:line="240" w:lineRule="auto"/>
-              <w:rPr>
-                <w:rStyle w:val="markedcontent"/>
-                <w:rFonts w:ascii="Times New Roman" w:hAnsi="Times New Roman"/>
-                <w:b/>
-                <w:bCs/>
-                <w:sz w:val="24"/>
-                <w:szCs w:val="24"/>
-              </w:rPr>
-            </w:pPr>
-            <w:r>
-              <w:rPr>
-                <w:rStyle w:val="markedcontent"/>
-                <w:rFonts w:ascii="Times New Roman" w:hAnsi="Times New Roman"/>
-                <w:b/>
-                <w:bCs/>
-                <w:sz w:val="24"/>
-                <w:szCs w:val="24"/>
-              </w:rPr>
-              <w:t xml:space="preserve">This is a second question which I am adding to this set.</w:t>
-            </w:r>
-            <w:r>
-              <w:rPr>
-                <w:rStyle w:val="markedcontent"/>
-                <w:rFonts w:ascii="Times New Roman" w:hAnsi="Times New Roman"/>
-                <w:b/>
-                <w:bCs/>
-                <w:sz w:val="24"/>
-                <w:szCs w:val="24"/>
-              </w:rPr>
-              <w:t xml:space="preserve"> </w:t>
-            </w:r>
-          </w:p>
-          <w:p>
-            <w:pPr>
-              <w:spacing w:after="0" w:line="240" w:lineRule="auto"/>
-              <w:jc w:val="both"/>
-              <w:rPr>
-                <w:rFonts w:ascii="Times New Roman" w:hAnsi="Times New Roman"/>
-                <w:b/>
-                <w:bCs/>
-                <w:sz w:val="24"/>
-                <w:szCs w:val="24"/>
-              </w:rPr>
-            </w:pPr>
-            <w:r>
-              <w:rPr>
-                <w:rStyle w:val="markedcontent"/>
-                <w:rFonts w:ascii="Times New Roman" w:hAnsi="Times New Roman"/>
-                <w:b/>
-                <w:bCs/>
-                <w:sz w:val="24"/>
-                <w:szCs w:val="24"/>
-              </w:rPr>
-              <w:drawing>
-                <wp:inline distT="0" distB="0" distL="0" distR="0">
-                  <wp:extent cx="1428750" cy="1428750"/>
-                  <wp:effectExtent l="0" t="0" r="0" b="0"/>
-                  <wp:docPr id="2" name="Image 2" descr="image"/>
-                  <wp:cNvGraphicFramePr>
-                    <a:graphicFrameLocks xmlns:a="http://schemas.openxmlformats.org/drawingml/2006/main" noChangeAspect="1"/>
-                  </wp:cNvGraphicFramePr>
-                  <a:graphic xmlns:a="http://schemas.openxmlformats.org/drawingml/2006/main">
-                    <a:graphicData uri="http://schemas.openxmlformats.org/drawingml/2006/picture">
-                      <pic:pic xmlns:pic="http://schemas.openxmlformats.org/drawingml/2006/picture">
-                        <pic:nvPicPr>
-                          <pic:cNvPr id="0" name="Picture 1" descr="image"/>
-                          <pic:cNvPicPr>
-                            <a:picLocks noChangeAspect="1" noChangeArrowheads="1"/>
-                          </pic:cNvPicPr>
-                        </pic:nvPicPr>
-                        <pic:blipFill>
-                          <a:blip r:embed="rId13">
-                            <a:extLst>
-                              <a:ext uri="{28A0092B-C50C-407E-A947-70E740481C1C}">
-                                <a14:useLocalDpi xmlns:a14="http://schemas.microsoft.com/office/drawing/2010/main" val="0"/>
-                              </a:ext>
-                            </a:extLst>
-                          </a:blip>
-                          <a:srcRect/>
-                          <a:stretch>
-                            <a:fillRect/>
-                          </a:stretch>
-                        </pic:blipFill>
-                        <pic:spPr bwMode="auto">
-                          <a:xfrm>
-                            <a:off x="0" y="0"/>
-                            <a:ext cx="1428750" cy="1428750"/>
-                          </a:xfrm>
-                          <a:prstGeom prst="rect">
-                            <a:avLst/>
-                          </a:prstGeom>
-                          <a:noFill/>
-                          <a:ln>
-                            <a:noFill/>
-                          </a:ln>
-                        </pic:spPr>
-                      </pic:pic>
-                    </a:graphicData>
-                  </a:graphic>
-                </wp:inline>
-              </w:drawing>
-            </w:r>
-            <w:r>
-              <w:rPr>
-                <w:rStyle w:val="markedcontent"/>
-                <w:rFonts w:ascii="Times New Roman" w:hAnsi="Times New Roman"/>
-                <w:b/>
-                <w:bCs/>
-                <w:sz w:val="24"/>
-                <w:szCs w:val="24"/>
-              </w:rPr>
-              <w:t/>
-            </w:r>
-            <w:r>
-              <w:rPr>
-                <w:rFonts w:ascii="Times New Roman" w:hAnsi="Times New Roman"/>
-                <w:b/>
-                <w:bCs/>
-                <w:sz w:val="24"/>
-                <w:szCs w:val="24"/>
-              </w:rPr>
-              <w:t xml:space="preserve"> </w:t>
-            </w:r>
-            <w:r>
-              <w:rPr>
-                <w:rStyle w:val="hljs-selector-id"/>
-                <w:rFonts w:ascii="Times New Roman" w:hAnsi="Times New Roman"/>
-                <w:b/>
-                <w:bCs/>
-                <w:sz w:val="24"/>
-                <w:szCs w:val="24"/>
-              </w:rPr>
-              <w:t/>
-            </w:r>
-            <w:r>
-              <w:rPr>
-                <w:rFonts w:ascii="Times New Roman" w:hAnsi="Times New Roman"/>
-                <w:b/>
-                <w:bCs/>
-                <w:sz w:val="24"/>
-                <w:szCs w:val="24"/>
-              </w:rPr>
-              <w:t/>
-            </w:r>
-          </w:p>
-          <w:p>
-            <w:pPr>
-              <w:spacing w:after="0" w:line="240" w:lineRule="auto"/>
-              <w:jc w:val="both"/>
-              <w:rPr>
-                <w:rFonts w:ascii="Times New Roman" w:hAnsi="Times New Roman"/>
-                <w:b/>
-                <w:bCs/>
-                <w:sz w:val="24"/>
-                <w:szCs w:val="24"/>
-              </w:rPr>
-            </w:pPr>
-            <w:r>
-              <w:rPr>
-                <w:rFonts w:ascii="Times New Roman" w:hAnsi="Times New Roman"/>
-                <w:b/>
-                <w:bCs/>
-                <w:sz w:val="24"/>
-                <w:szCs w:val="24"/>
-              </w:rPr>
-              <w:t xml:space="preserve"> A. text1</w:t>
-            </w:r>
-            <w:r>
-              <w:rPr>
-                <w:rStyle w:val="hljs-selector-id"/>
-                <w:rFonts w:ascii="Times New Roman" w:hAnsi="Times New Roman"/>
-                <w:b/>
-                <w:bCs/>
-                <w:sz w:val="24"/>
-                <w:szCs w:val="24"/>
-              </w:rPr>
-              <w:t/>
-            </w:r>
-            <w:r>
-              <w:rPr>
-                <w:rFonts w:ascii="Times New Roman" w:hAnsi="Times New Roman"/>
-                <w:b/>
-                <w:bCs/>
-                <w:sz w:val="24"/>
-                <w:szCs w:val="24"/>
-              </w:rPr>
-              <w:t/>
-            </w:r>
-          </w:p>
-          <w:p>
-            <w:pPr>
-              <w:spacing w:after="0" w:line="240" w:lineRule="auto"/>
-              <w:jc w:val="both"/>
-              <w:rPr>
-                <w:rFonts w:ascii="Times New Roman" w:hAnsi="Times New Roman"/>
-                <w:b/>
-                <w:bCs/>
-                <w:sz w:val="24"/>
-                <w:szCs w:val="24"/>
-              </w:rPr>
-            </w:pPr>
-            <w:r>
-              <w:rPr>
-                <w:rFonts w:ascii="Times New Roman" w:hAnsi="Times New Roman"/>
-                <w:b/>
-                <w:bCs/>
-                <w:sz w:val="24"/>
-                <w:szCs w:val="24"/>
-              </w:rPr>
-              <w:t xml:space="preserve"> B. text2</w:t>
-            </w:r>
-            <w:r>
-              <w:rPr>
-                <w:rStyle w:val="hljs-selector-id"/>
-                <w:rFonts w:ascii="Times New Roman" w:hAnsi="Times New Roman"/>
-                <w:b/>
-                <w:bCs/>
-                <w:sz w:val="24"/>
-                <w:szCs w:val="24"/>
-              </w:rPr>
-              <w:t/>
-            </w:r>
-            <w:r>
-              <w:rPr>
-                <w:rFonts w:ascii="Times New Roman" w:hAnsi="Times New Roman"/>
-                <w:b/>
-                <w:bCs/>
-                <w:sz w:val="24"/>
-                <w:szCs w:val="24"/>
-              </w:rPr>
-              <w:t/>
-            </w:r>
-          </w:p>
-          <w:p>
-            <w:pPr>
-              <w:spacing w:after="0" w:line="240" w:lineRule="auto"/>
-              <w:jc w:val="both"/>
-              <w:rPr>
-                <w:rFonts w:ascii="Times New Roman" w:hAnsi="Times New Roman"/>
-                <w:b/>
-                <w:bCs/>
-                <w:sz w:val="24"/>
-                <w:szCs w:val="24"/>
-              </w:rPr>
-            </w:pPr>
-            <w:r>
-              <w:rPr>
-                <w:rFonts w:ascii="Times New Roman" w:hAnsi="Times New Roman"/>
-                <w:b/>
-                <w:bCs/>
-                <w:sz w:val="24"/>
-                <w:szCs w:val="24"/>
-              </w:rPr>
-              <w:t xml:space="preserve"> C. text3</w:t>
-            </w:r>
-            <w:r>
-              <w:rPr>
-                <w:rStyle w:val="hljs-selector-id"/>
-                <w:rFonts w:ascii="Times New Roman" w:hAnsi="Times New Roman"/>
-                <w:b/>
-                <w:bCs/>
-                <w:sz w:val="24"/>
-                <w:szCs w:val="24"/>
-              </w:rPr>
-              <w:t/>
-            </w:r>
-            <w:r>
-              <w:rPr>
-                <w:rFonts w:ascii="Times New Roman" w:hAnsi="Times New Roman"/>
-                <w:b/>
-                <w:bCs/>
-                <w:sz w:val="24"/>
-                <w:szCs w:val="24"/>
-              </w:rPr>
-              <w:t/>
-            </w:r>
-          </w:p>
-          <w:p>
-            <w:pPr>
-              <w:spacing w:after="0" w:line="240" w:lineRule="auto"/>
-              <w:jc w:val="both"/>
-              <w:rPr>
-                <w:rFonts w:ascii="Times New Roman" w:hAnsi="Times New Roman"/>
-                <w:b/>
-                <w:bCs/>
-                <w:sz w:val="24"/>
-                <w:szCs w:val="24"/>
-              </w:rPr>
-            </w:pPr>
-            <w:r>
-              <w:rPr>
-                <w:rFonts w:ascii="Times New Roman" w:hAnsi="Times New Roman"/>
-                <w:b/>
-                <w:bCs/>
-                <w:sz w:val="24"/>
-                <w:szCs w:val="24"/>
-              </w:rPr>
-              <w:t xml:space="preserve"> D. text4</w:t>
+              <w:t xml:space="preserve"> D. Text1</w:t>
             </w:r>
           </w:p>
         </w:tc>

</xml_diff>

<commit_message>
Added Notification Icon and CSS
</commit_message>
<xml_diff>
--- a/backend/controllers/output_1.docx
+++ b/backend/controllers/output_1.docx
@@ -57,7 +57,7 @@
                       <w:szCs w:val="24"/>
                       <w:u w:val="single"/>
                     </w:rPr>
-                    <w:t xml:space="preserve">CSE531</w:t>
+                    <w:t xml:space="preserve">CSE493</w:t>
                   </w:r>
                   <w:proofErr w:type="spellStart"/>
                   <w:r>
@@ -419,7 +419,7 @@
                       <w:szCs w:val="24"/>
                       <w:u w:val="single"/>
                     </w:rPr>
-                    <w:t xml:space="preserve">Machine Learning</w:t>
+                    <w:t xml:space="preserve">OS Lab</w:t>
                   </w:r>
                   <w:proofErr w:type="spellStart"/>
                   <w:r>
@@ -1116,7 +1116,7 @@
                 <w:sz w:val="24"/>
                 <w:szCs w:val="24"/>
               </w:rPr>
-              <w:t xml:space="preserve">What is UI UX?</w:t>
+              <w:t xml:space="preserve">What is OS?</w:t>
             </w:r>
             <w:r>
               <w:rPr>
@@ -1263,7 +1263,7 @@
                 <w:sz w:val="24"/>
                 <w:szCs w:val="24"/>
               </w:rPr>
-              <w:t xml:space="preserve"> A. Text1</w:t>
+              <w:t xml:space="preserve"> A. JJ</w:t>
             </w:r>
             <w:r>
               <w:rPr>
@@ -1307,7 +1307,7 @@
                 <w:sz w:val="24"/>
                 <w:szCs w:val="24"/>
               </w:rPr>
-              <w:t xml:space="preserve"> B. Text1</w:t>
+              <w:t xml:space="preserve"> B. JJJJJJ</w:t>
             </w:r>
             <w:r>
               <w:rPr>
@@ -1351,7 +1351,7 @@
                 <w:sz w:val="24"/>
                 <w:szCs w:val="24"/>
               </w:rPr>
-              <w:t xml:space="preserve"> C. Text1</w:t>
+              <w:t xml:space="preserve"> C. JJJJ</w:t>
             </w:r>
             <w:r>
               <w:rPr>
@@ -1395,7 +1395,7 @@
                 <w:sz w:val="24"/>
                 <w:szCs w:val="24"/>
               </w:rPr>
-              <w:t xml:space="preserve"> D. Text1</w:t>
+              <w:t xml:space="preserve"> D. M</w:t>
             </w:r>
           </w:p>
         </w:tc>

</xml_diff>

<commit_message>
Edit in assign course and notification window
</commit_message>
<xml_diff>
--- a/backend/controllers/output_1.docx
+++ b/backend/controllers/output_1.docx
@@ -57,7 +57,7 @@
                       <w:szCs w:val="24"/>
                       <w:u w:val="single"/>
                     </w:rPr>
-                    <w:t xml:space="preserve">CSE493</w:t>
+                    <w:t xml:space="preserve">CSE316</w:t>
                   </w:r>
                   <w:proofErr w:type="spellStart"/>
                   <w:r>
@@ -131,7 +131,7 @@
                       <w:szCs w:val="24"/>
                       <w:u w:val="single"/>
                     </w:rPr>
-                    <w:t xml:space="preserve">undefined</w:t>
+                    <w:t xml:space="preserve">02/08/2024</w:t>
                   </w:r>
                   <w:proofErr w:type="spellStart"/>
                   <w:r>
@@ -345,7 +345,7 @@
                       <w:szCs w:val="24"/>
                       <w:u w:val="single"/>
                     </w:rPr>
-                    <w:t xml:space="preserve">undefined</w:t>
+                    <w:t xml:space="preserve">17/08/2024</w:t>
                   </w:r>
                   <w:proofErr w:type="spellStart"/>
                   <w:r>
@@ -419,7 +419,7 @@
                       <w:szCs w:val="24"/>
                       <w:u w:val="single"/>
                     </w:rPr>
-                    <w:t xml:space="preserve">OS Lab</w:t>
+                    <w:t xml:space="preserve">Operating System</w:t>
                   </w:r>
                   <w:proofErr w:type="spellStart"/>
                   <w:r>
@@ -564,7 +564,7 @@
                       <w:szCs w:val="24"/>
                       <w:u w:val="single"/>
                     </w:rPr>
-                    <w:t xml:space="preserve">undefined</w:t>
+                    <w:t xml:space="preserve">30</w:t>
                   </w:r>
                   <w:proofErr w:type="spellStart"/>
                   <w:r>
@@ -706,7 +706,7 @@
           <w:szCs w:val="24"/>
           <w:u w:val="single"/>
         </w:rPr>
-        <w:t xml:space="preserve">undefined</w:t>
+        <w:t xml:space="preserve">MCQ</w:t>
       </w:r>
       <w:proofErr w:type="spellStart"/>
       <w:r>
@@ -1116,7 +1116,7 @@
                 <w:sz w:val="24"/>
                 <w:szCs w:val="24"/>
               </w:rPr>
-              <w:t xml:space="preserve">What is OS?</w:t>
+              <w:t xml:space="preserve">dfvv</w:t>
             </w:r>
             <w:r>
               <w:rPr>
@@ -1151,54 +1151,6 @@
                 <w:sz w:val="24"/>
                 <w:szCs w:val="24"/>
               </w:rPr>
-              <w:drawing>
-                <wp:inline distT="0" distB="0" distL="0" distR="0">
-                  <wp:extent cx="1428750" cy="1428750"/>
-                  <wp:effectExtent l="0" t="0" r="0" b="0"/>
-                  <wp:docPr id="2" name="Image 2" descr="image"/>
-                  <wp:cNvGraphicFramePr>
-                    <a:graphicFrameLocks xmlns:a="http://schemas.openxmlformats.org/drawingml/2006/main" noChangeAspect="1"/>
-                  </wp:cNvGraphicFramePr>
-                  <a:graphic xmlns:a="http://schemas.openxmlformats.org/drawingml/2006/main">
-                    <a:graphicData uri="http://schemas.openxmlformats.org/drawingml/2006/picture">
-                      <pic:pic xmlns:pic="http://schemas.openxmlformats.org/drawingml/2006/picture">
-                        <pic:nvPicPr>
-                          <pic:cNvPr id="0" name="Picture 1" descr="image"/>
-                          <pic:cNvPicPr>
-                            <a:picLocks noChangeAspect="1" noChangeArrowheads="1"/>
-                          </pic:cNvPicPr>
-                        </pic:nvPicPr>
-                        <pic:blipFill>
-                          <a:blip r:embed="rId12">
-                            <a:extLst>
-                              <a:ext uri="{28A0092B-C50C-407E-A947-70E740481C1C}">
-                                <a14:useLocalDpi xmlns:a14="http://schemas.microsoft.com/office/drawing/2010/main" val="0"/>
-                              </a:ext>
-                            </a:extLst>
-                          </a:blip>
-                          <a:srcRect/>
-                          <a:stretch>
-                            <a:fillRect/>
-                          </a:stretch>
-                        </pic:blipFill>
-                        <pic:spPr bwMode="auto">
-                          <a:xfrm>
-                            <a:off x="0" y="0"/>
-                            <a:ext cx="1428750" cy="1428750"/>
-                          </a:xfrm>
-                          <a:prstGeom prst="rect">
-                            <a:avLst/>
-                          </a:prstGeom>
-                          <a:noFill/>
-                          <a:ln>
-                            <a:noFill/>
-                          </a:ln>
-                        </pic:spPr>
-                      </pic:pic>
-                    </a:graphicData>
-                  </a:graphic>
-                </wp:inline>
-              </w:drawing>
             </w:r>
             <w:r>
               <w:rPr>
@@ -1221,9 +1173,39 @@
               </w:rPr>
               <w:t xml:space="preserve"> </w:t>
             </w:r>
-            <w:r>
-              <w:rPr>
-                <w:rStyle w:val="hljs-selector-id"/>
+          </w:p>
+        </w:tc>
+        <w:tc>
+          <w:tcPr>
+            <w:tcW w:w="2153" w:type="dxa"/>
+            <w:tcBorders>
+              <w:top w:val="nil"/>
+              <w:bottom w:val="nil"/>
+            </w:tcBorders>
+            <w:shd w:val="clear" w:color="auto" w:fill="auto"/>
+          </w:tcPr>
+          <w:p>
+            <w:pPr>
+              <w:spacing w:after="0" w:line="240" w:lineRule="auto"/>
+              <w:rPr>
+                <w:rFonts w:ascii="Times New Roman" w:hAnsi="Times New Roman"/>
+                <w:sz w:val="24"/>
+                <w:szCs w:val="24"/>
+              </w:rPr>
+            </w:pPr>
+            <w:r>
+              <w:rPr>
+                <w:rFonts w:ascii="Times New Roman" w:hAnsi="Times New Roman"/>
+                <w:b/>
+                <w:bCs/>
+                <w:sz w:val="24"/>
+                <w:szCs w:val="24"/>
+              </w:rPr>
+              <w:t xml:space="preserve">CO1</w:t>
+            </w:r>
+            <w:proofErr w:type="spellStart"/>
+            <w:r>
+              <w:rPr>
                 <w:rFonts w:ascii="Times New Roman" w:hAnsi="Times New Roman"/>
                 <w:b/>
                 <w:bCs/>
@@ -1232,6 +1214,7 @@
               </w:rPr>
               <w:t/>
             </w:r>
+            <w:proofErr w:type="spellEnd"/>
             <w:r>
               <w:rPr>
                 <w:rFonts w:ascii="Times New Roman" w:hAnsi="Times New Roman"/>
@@ -1241,6 +1224,398 @@
                 <w:szCs w:val="24"/>
               </w:rPr>
               <w:t/>
+            </w:r>
+          </w:p>
+        </w:tc>
+        <w:tc>
+          <w:tcPr>
+            <w:tcW w:w="1787" w:type="dxa"/>
+            <w:tcBorders>
+              <w:top w:val="nil"/>
+              <w:bottom w:val="nil"/>
+            </w:tcBorders>
+            <w:shd w:val="clear" w:color="auto" w:fill="auto"/>
+          </w:tcPr>
+          <w:p>
+            <w:pPr>
+              <w:spacing w:after="0" w:line="240" w:lineRule="auto"/>
+              <w:rPr>
+                <w:rFonts w:ascii="Times New Roman" w:hAnsi="Times New Roman"/>
+                <w:b/>
+                <w:bCs/>
+                <w:sz w:val="24"/>
+                <w:szCs w:val="24"/>
+              </w:rPr>
+            </w:pPr>
+            <w:r>
+              <w:rPr>
+                <w:rFonts w:ascii="Times New Roman" w:hAnsi="Times New Roman"/>
+                <w:b/>
+                <w:bCs/>
+                <w:sz w:val="24"/>
+                <w:szCs w:val="24"/>
+              </w:rPr>
+              <w:t xml:space="preserve">L1</w:t>
+            </w:r>
+            <w:proofErr w:type="spellStart"/>
+            <w:r>
+              <w:rPr>
+                <w:rFonts w:ascii="Times New Roman" w:hAnsi="Times New Roman"/>
+                <w:b/>
+                <w:bCs/>
+                <w:sz w:val="24"/>
+                <w:szCs w:val="24"/>
+              </w:rPr>
+              <w:t/>
+            </w:r>
+            <w:proofErr w:type="spellEnd"/>
+            <w:r>
+              <w:rPr>
+                <w:rFonts w:ascii="Times New Roman" w:hAnsi="Times New Roman"/>
+                <w:b/>
+                <w:bCs/>
+                <w:sz w:val="24"/>
+                <w:szCs w:val="24"/>
+              </w:rPr>
+              <w:t/>
+            </w:r>
+          </w:p>
+        </w:tc>
+        <w:tc>
+          <w:tcPr>
+            <w:tcW w:w="2155" w:type="dxa"/>
+            <w:tcBorders>
+              <w:top w:val="nil"/>
+              <w:bottom w:val="nil"/>
+            </w:tcBorders>
+            <w:shd w:val="clear" w:color="auto" w:fill="auto"/>
+          </w:tcPr>
+          <w:p>
+            <w:pPr>
+              <w:spacing w:after="0" w:line="240" w:lineRule="auto"/>
+              <w:rPr>
+                <w:rFonts w:ascii="Times New Roman" w:hAnsi="Times New Roman"/>
+                <w:sz w:val="24"/>
+                <w:szCs w:val="24"/>
+              </w:rPr>
+            </w:pPr>
+            <w:r>
+              <w:rPr>
+                <w:rFonts w:ascii="Times New Roman" w:hAnsi="Times New Roman"/>
+                <w:sz w:val="24"/>
+                <w:szCs w:val="24"/>
+              </w:rPr>
+              <w:t xml:space="preserve">         </w:t>
+            </w:r>
+            <w:r>
+              <w:rPr>
+                <w:rFonts w:ascii="Times New Roman" w:hAnsi="Times New Roman"/>
+                <w:b/>
+                <w:bCs/>
+                <w:sz w:val="24"/>
+                <w:szCs w:val="24"/>
+              </w:rPr>
+              <w:t xml:space="preserve">30</w:t>
+            </w:r>
+          </w:p>
+        </w:tc>
+      </w:tr>
+      <w:tr>
+        <w:trPr>
+          <w:trHeight w:val="80"/>
+        </w:trPr>
+        <w:tc>
+          <w:tcPr>
+            <w:tcW w:w="1137" w:type="dxa"/>
+            <w:tcBorders>
+              <w:top w:val="nil"/>
+            </w:tcBorders>
+            <w:shd w:val="clear" w:color="auto" w:fill="auto"/>
+          </w:tcPr>
+          <w:p>
+            <w:pPr>
+              <w:spacing w:after="0" w:line="240" w:lineRule="auto"/>
+              <w:rPr>
+                <w:rFonts w:ascii="Times New Roman" w:hAnsi="Times New Roman"/>
+                <w:sz w:val="24"/>
+                <w:szCs w:val="24"/>
+              </w:rPr>
+            </w:pPr>
+            <w:r>
+              <w:rPr>
+                <w:rFonts w:ascii="Times New Roman" w:hAnsi="Times New Roman"/>
+                <w:sz w:val="24"/>
+                <w:szCs w:val="24"/>
+              </w:rPr>
+              <w:t/>
+            </w:r>
+          </w:p>
+        </w:tc>
+        <w:tc>
+          <w:tcPr>
+            <w:tcW w:w="5718" w:type="dxa"/>
+            <w:tcBorders>
+              <w:top w:val="nil"/>
+            </w:tcBorders>
+            <w:shd w:val="clear" w:color="auto" w:fill="auto"/>
+          </w:tcPr>
+          <w:p>
+            <w:pPr>
+              <w:spacing w:after="0" w:line="240" w:lineRule="auto"/>
+              <w:jc w:val="right"/>
+              <w:rPr>
+                <w:rFonts w:ascii="Times New Roman" w:hAnsi="Times New Roman"/>
+                <w:sz w:val="24"/>
+                <w:szCs w:val="24"/>
+              </w:rPr>
+            </w:pPr>
+          </w:p>
+        </w:tc>
+        <w:tc>
+          <w:tcPr>
+            <w:tcW w:w="2153" w:type="dxa"/>
+            <w:tcBorders>
+              <w:top w:val="nil"/>
+            </w:tcBorders>
+            <w:shd w:val="clear" w:color="auto" w:fill="auto"/>
+          </w:tcPr>
+          <w:p>
+            <w:pPr>
+              <w:spacing w:after="0" w:line="240" w:lineRule="auto"/>
+              <w:rPr>
+                <w:rFonts w:ascii="Times New Roman" w:hAnsi="Times New Roman"/>
+                <w:sz w:val="24"/>
+                <w:szCs w:val="24"/>
+              </w:rPr>
+            </w:pPr>
+          </w:p>
+        </w:tc>
+        <w:tc>
+          <w:tcPr>
+            <w:tcW w:w="1787" w:type="dxa"/>
+            <w:tcBorders>
+              <w:top w:val="nil"/>
+            </w:tcBorders>
+            <w:shd w:val="clear" w:color="auto" w:fill="auto"/>
+          </w:tcPr>
+          <w:p>
+            <w:pPr>
+              <w:spacing w:after="0" w:line="240" w:lineRule="auto"/>
+              <w:rPr>
+                <w:rFonts w:ascii="Times New Roman" w:hAnsi="Times New Roman"/>
+                <w:sz w:val="24"/>
+                <w:szCs w:val="24"/>
+              </w:rPr>
+            </w:pPr>
+          </w:p>
+        </w:tc>
+        <w:tc>
+          <w:tcPr>
+            <w:tcW w:w="2155" w:type="dxa"/>
+            <w:tcBorders>
+              <w:top w:val="nil"/>
+            </w:tcBorders>
+            <w:shd w:val="clear" w:color="auto" w:fill="auto"/>
+          </w:tcPr>
+          <w:p>
+            <w:pPr>
+              <w:spacing w:after="0" w:line="240" w:lineRule="auto"/>
+              <w:rPr>
+                <w:rFonts w:ascii="Times New Roman" w:hAnsi="Times New Roman"/>
+                <w:sz w:val="24"/>
+                <w:szCs w:val="24"/>
+              </w:rPr>
+            </w:pPr>
+          </w:p>
+        </w:tc>
+      </w:tr>
+      <w:tr>
+        <w:trPr>
+          <w:trHeight w:val="82"/>
+        </w:trPr>
+        <w:tc>
+          <w:tcPr>
+            <w:tcW w:w="1137" w:type="dxa"/>
+            <w:tcBorders>
+              <w:bottom w:val="nil"/>
+            </w:tcBorders>
+            <w:shd w:val="clear" w:color="auto" w:fill="auto"/>
+          </w:tcPr>
+          <w:p>
+            <w:pPr>
+              <w:spacing w:after="0" w:line="240" w:lineRule="auto"/>
+              <w:rPr>
+                <w:rFonts w:ascii="Times New Roman" w:hAnsi="Times New Roman"/>
+                <w:sz w:val="24"/>
+                <w:szCs w:val="24"/>
+              </w:rPr>
+            </w:pPr>
+            <w:r>
+              <w:rPr>
+                <w:rFonts w:ascii="Times New Roman" w:hAnsi="Times New Roman"/>
+                <w:sz w:val="24"/>
+                <w:szCs w:val="24"/>
+              </w:rPr>
+              <w:t/>
+            </w:r>
+          </w:p>
+        </w:tc>
+        <w:tc>
+          <w:tcPr>
+            <w:tcW w:w="5718" w:type="dxa"/>
+            <w:tcBorders>
+              <w:bottom w:val="nil"/>
+            </w:tcBorders>
+            <w:shd w:val="clear" w:color="auto" w:fill="auto"/>
+          </w:tcPr>
+          <w:p>
+            <w:pPr>
+              <w:spacing w:after="0" w:line="240" w:lineRule="auto"/>
+              <w:jc w:val="right"/>
+              <w:rPr>
+                <w:rFonts w:ascii="Times New Roman" w:hAnsi="Times New Roman"/>
+                <w:sz w:val="24"/>
+                <w:szCs w:val="24"/>
+              </w:rPr>
+            </w:pPr>
+          </w:p>
+        </w:tc>
+        <w:tc>
+          <w:tcPr>
+            <w:tcW w:w="2153" w:type="dxa"/>
+            <w:tcBorders>
+              <w:bottom w:val="nil"/>
+            </w:tcBorders>
+            <w:shd w:val="clear" w:color="auto" w:fill="auto"/>
+          </w:tcPr>
+          <w:p>
+            <w:pPr>
+              <w:spacing w:after="0" w:line="240" w:lineRule="auto"/>
+              <w:rPr>
+                <w:rFonts w:ascii="Times New Roman" w:hAnsi="Times New Roman"/>
+                <w:sz w:val="24"/>
+                <w:szCs w:val="24"/>
+              </w:rPr>
+            </w:pPr>
+          </w:p>
+        </w:tc>
+        <w:tc>
+          <w:tcPr>
+            <w:tcW w:w="1787" w:type="dxa"/>
+            <w:tcBorders>
+              <w:bottom w:val="nil"/>
+            </w:tcBorders>
+            <w:shd w:val="clear" w:color="auto" w:fill="auto"/>
+          </w:tcPr>
+          <w:p>
+            <w:pPr>
+              <w:spacing w:after="0" w:line="240" w:lineRule="auto"/>
+              <w:rPr>
+                <w:rFonts w:ascii="Times New Roman" w:hAnsi="Times New Roman"/>
+                <w:sz w:val="24"/>
+                <w:szCs w:val="24"/>
+              </w:rPr>
+            </w:pPr>
+          </w:p>
+        </w:tc>
+        <w:tc>
+          <w:tcPr>
+            <w:tcW w:w="2155" w:type="dxa"/>
+            <w:tcBorders>
+              <w:bottom w:val="nil"/>
+            </w:tcBorders>
+            <w:shd w:val="clear" w:color="auto" w:fill="auto"/>
+          </w:tcPr>
+          <w:p>
+            <w:pPr>
+              <w:spacing w:after="0" w:line="240" w:lineRule="auto"/>
+              <w:rPr>
+                <w:rFonts w:ascii="Times New Roman" w:hAnsi="Times New Roman"/>
+                <w:sz w:val="24"/>
+                <w:szCs w:val="24"/>
+              </w:rPr>
+            </w:pPr>
+          </w:p>
+        </w:tc>
+      </w:tr>
+      <w:tr>
+        <w:trPr>
+          <w:trHeight w:val="74"/>
+        </w:trPr>
+        <w:tc>
+          <w:tcPr>
+            <w:tcW w:w="1137" w:type="dxa"/>
+            <w:tcBorders>
+              <w:top w:val="nil"/>
+              <w:bottom w:val="nil"/>
+            </w:tcBorders>
+            <w:shd w:val="clear" w:color="auto" w:fill="auto"/>
+          </w:tcPr>
+          <w:p>
+            <w:pPr>
+              <w:spacing w:after="0" w:line="240" w:lineRule="auto"/>
+              <w:rPr>
+                <w:rFonts w:ascii="Times New Roman" w:hAnsi="Times New Roman"/>
+                <w:b/>
+                <w:bCs/>
+                <w:sz w:val="24"/>
+                <w:szCs w:val="24"/>
+              </w:rPr>
+            </w:pPr>
+            <w:r>
+              <w:rPr>
+                <w:rFonts w:ascii="Times New Roman" w:hAnsi="Times New Roman"/>
+                <w:b/>
+                <w:bCs/>
+                <w:sz w:val="24"/>
+                <w:szCs w:val="24"/>
+              </w:rPr>
+              <w:t xml:space="preserve">2</w:t>
+            </w:r>
+          </w:p>
+        </w:tc>
+        <w:tc>
+          <w:tcPr>
+            <w:tcW w:w="5718" w:type="dxa"/>
+            <w:tcBorders>
+              <w:top w:val="nil"/>
+              <w:bottom w:val="nil"/>
+            </w:tcBorders>
+            <w:shd w:val="clear" w:color="auto" w:fill="auto"/>
+          </w:tcPr>
+          <w:p>
+            <w:pPr>
+              <w:spacing w:after="0" w:line="240" w:lineRule="auto"/>
+              <w:rPr>
+                <w:rStyle w:val="markedcontent"/>
+                <w:rFonts w:ascii="Times New Roman" w:hAnsi="Times New Roman"/>
+                <w:b/>
+                <w:bCs/>
+                <w:sz w:val="24"/>
+                <w:szCs w:val="24"/>
+              </w:rPr>
+            </w:pPr>
+            <w:r>
+              <w:rPr>
+                <w:rStyle w:val="markedcontent"/>
+                <w:rFonts w:ascii="Times New Roman" w:hAnsi="Times New Roman"/>
+                <w:b/>
+                <w:bCs/>
+                <w:sz w:val="24"/>
+                <w:szCs w:val="24"/>
+              </w:rPr>
+              <w:t xml:space="preserve">ada</w:t>
+            </w:r>
+            <w:r>
+              <w:rPr>
+                <w:rStyle w:val="markedcontent"/>
+                <w:rFonts w:ascii="Times New Roman" w:hAnsi="Times New Roman"/>
+                <w:b/>
+                <w:bCs/>
+                <w:sz w:val="24"/>
+                <w:szCs w:val="24"/>
+              </w:rPr>
+              <w:t xml:space="preserve"> </w:t>
             </w:r>
           </w:p>
           <w:p>
@@ -1257,13 +1632,34 @@
             </w:pPr>
             <w:r>
               <w:rPr>
-                <w:rFonts w:ascii="Times New Roman" w:hAnsi="Times New Roman"/>
-                <w:b/>
-                <w:bCs/>
-                <w:sz w:val="24"/>
-                <w:szCs w:val="24"/>
-              </w:rPr>
-              <w:t xml:space="preserve"> A. JJ</w:t>
+                <w:rStyle w:val="markedcontent"/>
+                <w:rFonts w:ascii="Times New Roman" w:hAnsi="Times New Roman"/>
+                <w:b/>
+                <w:bCs/>
+                <w:sz w:val="24"/>
+                <w:szCs w:val="24"/>
+              </w:rPr>
+            </w:r>
+            <w:r>
+              <w:rPr>
+                <w:rStyle w:val="markedcontent"/>
+                <w:rFonts w:ascii="Times New Roman" w:hAnsi="Times New Roman"/>
+                <w:b/>
+                <w:bCs/>
+                <w:sz w:val="24"/>
+                <w:szCs w:val="24"/>
+              </w:rPr>
+              <w:t/>
+            </w:r>
+            <w:r>
+              <w:rPr>
+                <w:rFonts w:ascii="Times New Roman" w:hAnsi="Times New Roman"/>
+                <w:b/>
+                <w:bCs/>
+                <w:sz w:val="24"/>
+                <w:szCs w:val="24"/>
+              </w:rPr>
+              <w:t xml:space="preserve"> </w:t>
             </w:r>
             <w:r>
               <w:rPr>
@@ -1307,7 +1703,7 @@
                 <w:sz w:val="24"/>
                 <w:szCs w:val="24"/>
               </w:rPr>
-              <w:t xml:space="preserve"> B. JJJJJJ</w:t>
+              <w:t xml:space="preserve"> A. dad</w:t>
             </w:r>
             <w:r>
               <w:rPr>
@@ -1351,7 +1747,7 @@
                 <w:sz w:val="24"/>
                 <w:szCs w:val="24"/>
               </w:rPr>
-              <w:t xml:space="preserve"> C. JJJJ</w:t>
+              <w:t xml:space="preserve"> B. adad</w:t>
             </w:r>
             <w:r>
               <w:rPr>
@@ -1395,7 +1791,51 @@
                 <w:sz w:val="24"/>
                 <w:szCs w:val="24"/>
               </w:rPr>
-              <w:t xml:space="preserve"> D. M</w:t>
+              <w:t xml:space="preserve"> C. jjj</w:t>
+            </w:r>
+            <w:r>
+              <w:rPr>
+                <w:rStyle w:val="hljs-selector-id"/>
+                <w:rFonts w:ascii="Times New Roman" w:hAnsi="Times New Roman"/>
+                <w:b/>
+                <w:bCs/>
+                <w:sz w:val="24"/>
+                <w:szCs w:val="24"/>
+              </w:rPr>
+              <w:t/>
+            </w:r>
+            <w:r>
+              <w:rPr>
+                <w:rFonts w:ascii="Times New Roman" w:hAnsi="Times New Roman"/>
+                <w:b/>
+                <w:bCs/>
+                <w:sz w:val="24"/>
+                <w:szCs w:val="24"/>
+              </w:rPr>
+              <w:t/>
+            </w:r>
+          </w:p>
+          <w:p>
+            <w:pPr>
+              <w:spacing w:after="0" w:line="240" w:lineRule="auto"/>
+              <w:jc w:val="both"/>
+              <w:rPr>
+                <w:rFonts w:ascii="Times New Roman" w:hAnsi="Times New Roman"/>
+                <w:b/>
+                <w:bCs/>
+                <w:sz w:val="24"/>
+                <w:szCs w:val="24"/>
+              </w:rPr>
+            </w:pPr>
+            <w:r>
+              <w:rPr>
+                <w:rFonts w:ascii="Times New Roman" w:hAnsi="Times New Roman"/>
+                <w:b/>
+                <w:bCs/>
+                <w:sz w:val="24"/>
+                <w:szCs w:val="24"/>
+              </w:rPr>
+              <w:t xml:space="preserve"> D. jjj</w:t>
             </w:r>
           </w:p>
         </w:tc>

</xml_diff>

<commit_message>
Added Solution Parameter to question
</commit_message>
<xml_diff>
--- a/backend/controllers/output_1.docx
+++ b/backend/controllers/output_1.docx
@@ -131,7 +131,7 @@
                       <w:szCs w:val="24"/>
                       <w:u w:val="single"/>
                     </w:rPr>
-                    <w:t xml:space="preserve">02/08/2024</w:t>
+                    <w:t xml:space="preserve">11/08/2024</w:t>
                   </w:r>
                   <w:proofErr w:type="spellStart"/>
                   <w:r>
@@ -205,7 +205,7 @@
                       <w:szCs w:val="24"/>
                       <w:u w:val="single"/>
                     </w:rPr>
-                    <w:t xml:space="preserve">CA1</w:t>
+                    <w:t xml:space="preserve">CA3</w:t>
                   </w:r>
                   <w:proofErr w:type="spellStart"/>
                   <w:r>
@@ -1116,7 +1116,7 @@
                 <w:sz w:val="24"/>
                 <w:szCs w:val="24"/>
               </w:rPr>
-              <w:t xml:space="preserve">dfvv</w:t>
+              <w:t xml:space="preserve">This is a test question.</w:t>
             </w:r>
             <w:r>
               <w:rPr>
@@ -1172,670 +1172,6 @@
                 <w:szCs w:val="24"/>
               </w:rPr>
               <w:t xml:space="preserve"> </w:t>
-            </w:r>
-          </w:p>
-        </w:tc>
-        <w:tc>
-          <w:tcPr>
-            <w:tcW w:w="2153" w:type="dxa"/>
-            <w:tcBorders>
-              <w:top w:val="nil"/>
-              <w:bottom w:val="nil"/>
-            </w:tcBorders>
-            <w:shd w:val="clear" w:color="auto" w:fill="auto"/>
-          </w:tcPr>
-          <w:p>
-            <w:pPr>
-              <w:spacing w:after="0" w:line="240" w:lineRule="auto"/>
-              <w:rPr>
-                <w:rFonts w:ascii="Times New Roman" w:hAnsi="Times New Roman"/>
-                <w:sz w:val="24"/>
-                <w:szCs w:val="24"/>
-              </w:rPr>
-            </w:pPr>
-            <w:r>
-              <w:rPr>
-                <w:rFonts w:ascii="Times New Roman" w:hAnsi="Times New Roman"/>
-                <w:b/>
-                <w:bCs/>
-                <w:sz w:val="24"/>
-                <w:szCs w:val="24"/>
-              </w:rPr>
-              <w:t xml:space="preserve">CO1</w:t>
-            </w:r>
-            <w:proofErr w:type="spellStart"/>
-            <w:r>
-              <w:rPr>
-                <w:rFonts w:ascii="Times New Roman" w:hAnsi="Times New Roman"/>
-                <w:b/>
-                <w:bCs/>
-                <w:sz w:val="24"/>
-                <w:szCs w:val="24"/>
-              </w:rPr>
-              <w:t/>
-            </w:r>
-            <w:proofErr w:type="spellEnd"/>
-            <w:r>
-              <w:rPr>
-                <w:rFonts w:ascii="Times New Roman" w:hAnsi="Times New Roman"/>
-                <w:b/>
-                <w:bCs/>
-                <w:sz w:val="24"/>
-                <w:szCs w:val="24"/>
-              </w:rPr>
-              <w:t/>
-            </w:r>
-          </w:p>
-        </w:tc>
-        <w:tc>
-          <w:tcPr>
-            <w:tcW w:w="1787" w:type="dxa"/>
-            <w:tcBorders>
-              <w:top w:val="nil"/>
-              <w:bottom w:val="nil"/>
-            </w:tcBorders>
-            <w:shd w:val="clear" w:color="auto" w:fill="auto"/>
-          </w:tcPr>
-          <w:p>
-            <w:pPr>
-              <w:spacing w:after="0" w:line="240" w:lineRule="auto"/>
-              <w:rPr>
-                <w:rFonts w:ascii="Times New Roman" w:hAnsi="Times New Roman"/>
-                <w:b/>
-                <w:bCs/>
-                <w:sz w:val="24"/>
-                <w:szCs w:val="24"/>
-              </w:rPr>
-            </w:pPr>
-            <w:r>
-              <w:rPr>
-                <w:rFonts w:ascii="Times New Roman" w:hAnsi="Times New Roman"/>
-                <w:b/>
-                <w:bCs/>
-                <w:sz w:val="24"/>
-                <w:szCs w:val="24"/>
-              </w:rPr>
-              <w:t xml:space="preserve">L1</w:t>
-            </w:r>
-            <w:proofErr w:type="spellStart"/>
-            <w:r>
-              <w:rPr>
-                <w:rFonts w:ascii="Times New Roman" w:hAnsi="Times New Roman"/>
-                <w:b/>
-                <w:bCs/>
-                <w:sz w:val="24"/>
-                <w:szCs w:val="24"/>
-              </w:rPr>
-              <w:t/>
-            </w:r>
-            <w:proofErr w:type="spellEnd"/>
-            <w:r>
-              <w:rPr>
-                <w:rFonts w:ascii="Times New Roman" w:hAnsi="Times New Roman"/>
-                <w:b/>
-                <w:bCs/>
-                <w:sz w:val="24"/>
-                <w:szCs w:val="24"/>
-              </w:rPr>
-              <w:t/>
-            </w:r>
-          </w:p>
-        </w:tc>
-        <w:tc>
-          <w:tcPr>
-            <w:tcW w:w="2155" w:type="dxa"/>
-            <w:tcBorders>
-              <w:top w:val="nil"/>
-              <w:bottom w:val="nil"/>
-            </w:tcBorders>
-            <w:shd w:val="clear" w:color="auto" w:fill="auto"/>
-          </w:tcPr>
-          <w:p>
-            <w:pPr>
-              <w:spacing w:after="0" w:line="240" w:lineRule="auto"/>
-              <w:rPr>
-                <w:rFonts w:ascii="Times New Roman" w:hAnsi="Times New Roman"/>
-                <w:sz w:val="24"/>
-                <w:szCs w:val="24"/>
-              </w:rPr>
-            </w:pPr>
-            <w:r>
-              <w:rPr>
-                <w:rFonts w:ascii="Times New Roman" w:hAnsi="Times New Roman"/>
-                <w:sz w:val="24"/>
-                <w:szCs w:val="24"/>
-              </w:rPr>
-              <w:t xml:space="preserve">         </w:t>
-            </w:r>
-            <w:r>
-              <w:rPr>
-                <w:rFonts w:ascii="Times New Roman" w:hAnsi="Times New Roman"/>
-                <w:b/>
-                <w:bCs/>
-                <w:sz w:val="24"/>
-                <w:szCs w:val="24"/>
-              </w:rPr>
-              <w:t xml:space="preserve">30</w:t>
-            </w:r>
-          </w:p>
-        </w:tc>
-      </w:tr>
-      <w:tr>
-        <w:trPr>
-          <w:trHeight w:val="80"/>
-        </w:trPr>
-        <w:tc>
-          <w:tcPr>
-            <w:tcW w:w="1137" w:type="dxa"/>
-            <w:tcBorders>
-              <w:top w:val="nil"/>
-            </w:tcBorders>
-            <w:shd w:val="clear" w:color="auto" w:fill="auto"/>
-          </w:tcPr>
-          <w:p>
-            <w:pPr>
-              <w:spacing w:after="0" w:line="240" w:lineRule="auto"/>
-              <w:rPr>
-                <w:rFonts w:ascii="Times New Roman" w:hAnsi="Times New Roman"/>
-                <w:sz w:val="24"/>
-                <w:szCs w:val="24"/>
-              </w:rPr>
-            </w:pPr>
-            <w:r>
-              <w:rPr>
-                <w:rFonts w:ascii="Times New Roman" w:hAnsi="Times New Roman"/>
-                <w:sz w:val="24"/>
-                <w:szCs w:val="24"/>
-              </w:rPr>
-              <w:t/>
-            </w:r>
-          </w:p>
-        </w:tc>
-        <w:tc>
-          <w:tcPr>
-            <w:tcW w:w="5718" w:type="dxa"/>
-            <w:tcBorders>
-              <w:top w:val="nil"/>
-            </w:tcBorders>
-            <w:shd w:val="clear" w:color="auto" w:fill="auto"/>
-          </w:tcPr>
-          <w:p>
-            <w:pPr>
-              <w:spacing w:after="0" w:line="240" w:lineRule="auto"/>
-              <w:jc w:val="right"/>
-              <w:rPr>
-                <w:rFonts w:ascii="Times New Roman" w:hAnsi="Times New Roman"/>
-                <w:sz w:val="24"/>
-                <w:szCs w:val="24"/>
-              </w:rPr>
-            </w:pPr>
-          </w:p>
-        </w:tc>
-        <w:tc>
-          <w:tcPr>
-            <w:tcW w:w="2153" w:type="dxa"/>
-            <w:tcBorders>
-              <w:top w:val="nil"/>
-            </w:tcBorders>
-            <w:shd w:val="clear" w:color="auto" w:fill="auto"/>
-          </w:tcPr>
-          <w:p>
-            <w:pPr>
-              <w:spacing w:after="0" w:line="240" w:lineRule="auto"/>
-              <w:rPr>
-                <w:rFonts w:ascii="Times New Roman" w:hAnsi="Times New Roman"/>
-                <w:sz w:val="24"/>
-                <w:szCs w:val="24"/>
-              </w:rPr>
-            </w:pPr>
-          </w:p>
-        </w:tc>
-        <w:tc>
-          <w:tcPr>
-            <w:tcW w:w="1787" w:type="dxa"/>
-            <w:tcBorders>
-              <w:top w:val="nil"/>
-            </w:tcBorders>
-            <w:shd w:val="clear" w:color="auto" w:fill="auto"/>
-          </w:tcPr>
-          <w:p>
-            <w:pPr>
-              <w:spacing w:after="0" w:line="240" w:lineRule="auto"/>
-              <w:rPr>
-                <w:rFonts w:ascii="Times New Roman" w:hAnsi="Times New Roman"/>
-                <w:sz w:val="24"/>
-                <w:szCs w:val="24"/>
-              </w:rPr>
-            </w:pPr>
-          </w:p>
-        </w:tc>
-        <w:tc>
-          <w:tcPr>
-            <w:tcW w:w="2155" w:type="dxa"/>
-            <w:tcBorders>
-              <w:top w:val="nil"/>
-            </w:tcBorders>
-            <w:shd w:val="clear" w:color="auto" w:fill="auto"/>
-          </w:tcPr>
-          <w:p>
-            <w:pPr>
-              <w:spacing w:after="0" w:line="240" w:lineRule="auto"/>
-              <w:rPr>
-                <w:rFonts w:ascii="Times New Roman" w:hAnsi="Times New Roman"/>
-                <w:sz w:val="24"/>
-                <w:szCs w:val="24"/>
-              </w:rPr>
-            </w:pPr>
-          </w:p>
-        </w:tc>
-      </w:tr>
-      <w:tr>
-        <w:trPr>
-          <w:trHeight w:val="82"/>
-        </w:trPr>
-        <w:tc>
-          <w:tcPr>
-            <w:tcW w:w="1137" w:type="dxa"/>
-            <w:tcBorders>
-              <w:bottom w:val="nil"/>
-            </w:tcBorders>
-            <w:shd w:val="clear" w:color="auto" w:fill="auto"/>
-          </w:tcPr>
-          <w:p>
-            <w:pPr>
-              <w:spacing w:after="0" w:line="240" w:lineRule="auto"/>
-              <w:rPr>
-                <w:rFonts w:ascii="Times New Roman" w:hAnsi="Times New Roman"/>
-                <w:sz w:val="24"/>
-                <w:szCs w:val="24"/>
-              </w:rPr>
-            </w:pPr>
-            <w:r>
-              <w:rPr>
-                <w:rFonts w:ascii="Times New Roman" w:hAnsi="Times New Roman"/>
-                <w:sz w:val="24"/>
-                <w:szCs w:val="24"/>
-              </w:rPr>
-              <w:t/>
-            </w:r>
-          </w:p>
-        </w:tc>
-        <w:tc>
-          <w:tcPr>
-            <w:tcW w:w="5718" w:type="dxa"/>
-            <w:tcBorders>
-              <w:bottom w:val="nil"/>
-            </w:tcBorders>
-            <w:shd w:val="clear" w:color="auto" w:fill="auto"/>
-          </w:tcPr>
-          <w:p>
-            <w:pPr>
-              <w:spacing w:after="0" w:line="240" w:lineRule="auto"/>
-              <w:jc w:val="right"/>
-              <w:rPr>
-                <w:rFonts w:ascii="Times New Roman" w:hAnsi="Times New Roman"/>
-                <w:sz w:val="24"/>
-                <w:szCs w:val="24"/>
-              </w:rPr>
-            </w:pPr>
-          </w:p>
-        </w:tc>
-        <w:tc>
-          <w:tcPr>
-            <w:tcW w:w="2153" w:type="dxa"/>
-            <w:tcBorders>
-              <w:bottom w:val="nil"/>
-            </w:tcBorders>
-            <w:shd w:val="clear" w:color="auto" w:fill="auto"/>
-          </w:tcPr>
-          <w:p>
-            <w:pPr>
-              <w:spacing w:after="0" w:line="240" w:lineRule="auto"/>
-              <w:rPr>
-                <w:rFonts w:ascii="Times New Roman" w:hAnsi="Times New Roman"/>
-                <w:sz w:val="24"/>
-                <w:szCs w:val="24"/>
-              </w:rPr>
-            </w:pPr>
-          </w:p>
-        </w:tc>
-        <w:tc>
-          <w:tcPr>
-            <w:tcW w:w="1787" w:type="dxa"/>
-            <w:tcBorders>
-              <w:bottom w:val="nil"/>
-            </w:tcBorders>
-            <w:shd w:val="clear" w:color="auto" w:fill="auto"/>
-          </w:tcPr>
-          <w:p>
-            <w:pPr>
-              <w:spacing w:after="0" w:line="240" w:lineRule="auto"/>
-              <w:rPr>
-                <w:rFonts w:ascii="Times New Roman" w:hAnsi="Times New Roman"/>
-                <w:sz w:val="24"/>
-                <w:szCs w:val="24"/>
-              </w:rPr>
-            </w:pPr>
-          </w:p>
-        </w:tc>
-        <w:tc>
-          <w:tcPr>
-            <w:tcW w:w="2155" w:type="dxa"/>
-            <w:tcBorders>
-              <w:bottom w:val="nil"/>
-            </w:tcBorders>
-            <w:shd w:val="clear" w:color="auto" w:fill="auto"/>
-          </w:tcPr>
-          <w:p>
-            <w:pPr>
-              <w:spacing w:after="0" w:line="240" w:lineRule="auto"/>
-              <w:rPr>
-                <w:rFonts w:ascii="Times New Roman" w:hAnsi="Times New Roman"/>
-                <w:sz w:val="24"/>
-                <w:szCs w:val="24"/>
-              </w:rPr>
-            </w:pPr>
-          </w:p>
-        </w:tc>
-      </w:tr>
-      <w:tr>
-        <w:trPr>
-          <w:trHeight w:val="74"/>
-        </w:trPr>
-        <w:tc>
-          <w:tcPr>
-            <w:tcW w:w="1137" w:type="dxa"/>
-            <w:tcBorders>
-              <w:top w:val="nil"/>
-              <w:bottom w:val="nil"/>
-            </w:tcBorders>
-            <w:shd w:val="clear" w:color="auto" w:fill="auto"/>
-          </w:tcPr>
-          <w:p>
-            <w:pPr>
-              <w:spacing w:after="0" w:line="240" w:lineRule="auto"/>
-              <w:rPr>
-                <w:rFonts w:ascii="Times New Roman" w:hAnsi="Times New Roman"/>
-                <w:b/>
-                <w:bCs/>
-                <w:sz w:val="24"/>
-                <w:szCs w:val="24"/>
-              </w:rPr>
-            </w:pPr>
-            <w:r>
-              <w:rPr>
-                <w:rFonts w:ascii="Times New Roman" w:hAnsi="Times New Roman"/>
-                <w:b/>
-                <w:bCs/>
-                <w:sz w:val="24"/>
-                <w:szCs w:val="24"/>
-              </w:rPr>
-              <w:t xml:space="preserve">2</w:t>
-            </w:r>
-          </w:p>
-        </w:tc>
-        <w:tc>
-          <w:tcPr>
-            <w:tcW w:w="5718" w:type="dxa"/>
-            <w:tcBorders>
-              <w:top w:val="nil"/>
-              <w:bottom w:val="nil"/>
-            </w:tcBorders>
-            <w:shd w:val="clear" w:color="auto" w:fill="auto"/>
-          </w:tcPr>
-          <w:p>
-            <w:pPr>
-              <w:spacing w:after="0" w:line="240" w:lineRule="auto"/>
-              <w:rPr>
-                <w:rStyle w:val="markedcontent"/>
-                <w:rFonts w:ascii="Times New Roman" w:hAnsi="Times New Roman"/>
-                <w:b/>
-                <w:bCs/>
-                <w:sz w:val="24"/>
-                <w:szCs w:val="24"/>
-              </w:rPr>
-            </w:pPr>
-            <w:r>
-              <w:rPr>
-                <w:rStyle w:val="markedcontent"/>
-                <w:rFonts w:ascii="Times New Roman" w:hAnsi="Times New Roman"/>
-                <w:b/>
-                <w:bCs/>
-                <w:sz w:val="24"/>
-                <w:szCs w:val="24"/>
-              </w:rPr>
-              <w:t xml:space="preserve">ada</w:t>
-            </w:r>
-            <w:r>
-              <w:rPr>
-                <w:rStyle w:val="markedcontent"/>
-                <w:rFonts w:ascii="Times New Roman" w:hAnsi="Times New Roman"/>
-                <w:b/>
-                <w:bCs/>
-                <w:sz w:val="24"/>
-                <w:szCs w:val="24"/>
-              </w:rPr>
-              <w:t xml:space="preserve"> </w:t>
-            </w:r>
-          </w:p>
-          <w:p>
-            <w:pPr>
-              <w:spacing w:after="0" w:line="240" w:lineRule="auto"/>
-              <w:jc w:val="both"/>
-              <w:rPr>
-                <w:rFonts w:ascii="Times New Roman" w:hAnsi="Times New Roman"/>
-                <w:b/>
-                <w:bCs/>
-                <w:sz w:val="24"/>
-                <w:szCs w:val="24"/>
-              </w:rPr>
-            </w:pPr>
-            <w:r>
-              <w:rPr>
-                <w:rStyle w:val="markedcontent"/>
-                <w:rFonts w:ascii="Times New Roman" w:hAnsi="Times New Roman"/>
-                <w:b/>
-                <w:bCs/>
-                <w:sz w:val="24"/>
-                <w:szCs w:val="24"/>
-              </w:rPr>
-            </w:r>
-            <w:r>
-              <w:rPr>
-                <w:rStyle w:val="markedcontent"/>
-                <w:rFonts w:ascii="Times New Roman" w:hAnsi="Times New Roman"/>
-                <w:b/>
-                <w:bCs/>
-                <w:sz w:val="24"/>
-                <w:szCs w:val="24"/>
-              </w:rPr>
-              <w:t/>
-            </w:r>
-            <w:r>
-              <w:rPr>
-                <w:rFonts w:ascii="Times New Roman" w:hAnsi="Times New Roman"/>
-                <w:b/>
-                <w:bCs/>
-                <w:sz w:val="24"/>
-                <w:szCs w:val="24"/>
-              </w:rPr>
-              <w:t xml:space="preserve"> </w:t>
-            </w:r>
-            <w:r>
-              <w:rPr>
-                <w:rStyle w:val="hljs-selector-id"/>
-                <w:rFonts w:ascii="Times New Roman" w:hAnsi="Times New Roman"/>
-                <w:b/>
-                <w:bCs/>
-                <w:sz w:val="24"/>
-                <w:szCs w:val="24"/>
-              </w:rPr>
-              <w:t/>
-            </w:r>
-            <w:r>
-              <w:rPr>
-                <w:rFonts w:ascii="Times New Roman" w:hAnsi="Times New Roman"/>
-                <w:b/>
-                <w:bCs/>
-                <w:sz w:val="24"/>
-                <w:szCs w:val="24"/>
-              </w:rPr>
-              <w:t/>
-            </w:r>
-          </w:p>
-          <w:p>
-            <w:pPr>
-              <w:spacing w:after="0" w:line="240" w:lineRule="auto"/>
-              <w:jc w:val="both"/>
-              <w:rPr>
-                <w:rFonts w:ascii="Times New Roman" w:hAnsi="Times New Roman"/>
-                <w:b/>
-                <w:bCs/>
-                <w:sz w:val="24"/>
-                <w:szCs w:val="24"/>
-              </w:rPr>
-            </w:pPr>
-            <w:r>
-              <w:rPr>
-                <w:rFonts w:ascii="Times New Roman" w:hAnsi="Times New Roman"/>
-                <w:b/>
-                <w:bCs/>
-                <w:sz w:val="24"/>
-                <w:szCs w:val="24"/>
-              </w:rPr>
-              <w:t xml:space="preserve"> A. dad</w:t>
-            </w:r>
-            <w:r>
-              <w:rPr>
-                <w:rStyle w:val="hljs-selector-id"/>
-                <w:rFonts w:ascii="Times New Roman" w:hAnsi="Times New Roman"/>
-                <w:b/>
-                <w:bCs/>
-                <w:sz w:val="24"/>
-                <w:szCs w:val="24"/>
-              </w:rPr>
-              <w:t/>
-            </w:r>
-            <w:r>
-              <w:rPr>
-                <w:rFonts w:ascii="Times New Roman" w:hAnsi="Times New Roman"/>
-                <w:b/>
-                <w:bCs/>
-                <w:sz w:val="24"/>
-                <w:szCs w:val="24"/>
-              </w:rPr>
-              <w:t/>
-            </w:r>
-          </w:p>
-          <w:p>
-            <w:pPr>
-              <w:spacing w:after="0" w:line="240" w:lineRule="auto"/>
-              <w:jc w:val="both"/>
-              <w:rPr>
-                <w:rFonts w:ascii="Times New Roman" w:hAnsi="Times New Roman"/>
-                <w:b/>
-                <w:bCs/>
-                <w:sz w:val="24"/>
-                <w:szCs w:val="24"/>
-              </w:rPr>
-            </w:pPr>
-            <w:r>
-              <w:rPr>
-                <w:rFonts w:ascii="Times New Roman" w:hAnsi="Times New Roman"/>
-                <w:b/>
-                <w:bCs/>
-                <w:sz w:val="24"/>
-                <w:szCs w:val="24"/>
-              </w:rPr>
-              <w:t xml:space="preserve"> B. adad</w:t>
-            </w:r>
-            <w:r>
-              <w:rPr>
-                <w:rStyle w:val="hljs-selector-id"/>
-                <w:rFonts w:ascii="Times New Roman" w:hAnsi="Times New Roman"/>
-                <w:b/>
-                <w:bCs/>
-                <w:sz w:val="24"/>
-                <w:szCs w:val="24"/>
-              </w:rPr>
-              <w:t/>
-            </w:r>
-            <w:r>
-              <w:rPr>
-                <w:rFonts w:ascii="Times New Roman" w:hAnsi="Times New Roman"/>
-                <w:b/>
-                <w:bCs/>
-                <w:sz w:val="24"/>
-                <w:szCs w:val="24"/>
-              </w:rPr>
-              <w:t/>
-            </w:r>
-          </w:p>
-          <w:p>
-            <w:pPr>
-              <w:spacing w:after="0" w:line="240" w:lineRule="auto"/>
-              <w:jc w:val="both"/>
-              <w:rPr>
-                <w:rFonts w:ascii="Times New Roman" w:hAnsi="Times New Roman"/>
-                <w:b/>
-                <w:bCs/>
-                <w:sz w:val="24"/>
-                <w:szCs w:val="24"/>
-              </w:rPr>
-            </w:pPr>
-            <w:r>
-              <w:rPr>
-                <w:rFonts w:ascii="Times New Roman" w:hAnsi="Times New Roman"/>
-                <w:b/>
-                <w:bCs/>
-                <w:sz w:val="24"/>
-                <w:szCs w:val="24"/>
-              </w:rPr>
-              <w:t xml:space="preserve"> C. jjj</w:t>
-            </w:r>
-            <w:r>
-              <w:rPr>
-                <w:rStyle w:val="hljs-selector-id"/>
-                <w:rFonts w:ascii="Times New Roman" w:hAnsi="Times New Roman"/>
-                <w:b/>
-                <w:bCs/>
-                <w:sz w:val="24"/>
-                <w:szCs w:val="24"/>
-              </w:rPr>
-              <w:t/>
-            </w:r>
-            <w:r>
-              <w:rPr>
-                <w:rFonts w:ascii="Times New Roman" w:hAnsi="Times New Roman"/>
-                <w:b/>
-                <w:bCs/>
-                <w:sz w:val="24"/>
-                <w:szCs w:val="24"/>
-              </w:rPr>
-              <w:t/>
-            </w:r>
-          </w:p>
-          <w:p>
-            <w:pPr>
-              <w:spacing w:after="0" w:line="240" w:lineRule="auto"/>
-              <w:jc w:val="both"/>
-              <w:rPr>
-                <w:rFonts w:ascii="Times New Roman" w:hAnsi="Times New Roman"/>
-                <w:b/>
-                <w:bCs/>
-                <w:sz w:val="24"/>
-                <w:szCs w:val="24"/>
-              </w:rPr>
-            </w:pPr>
-            <w:r>
-              <w:rPr>
-                <w:rFonts w:ascii="Times New Roman" w:hAnsi="Times New Roman"/>
-                <w:b/>
-                <w:bCs/>
-                <w:sz w:val="24"/>
-                <w:szCs w:val="24"/>
-              </w:rPr>
-              <w:t xml:space="preserve"> D. jjj</w:t>
             </w:r>
           </w:p>
         </w:tc>

</xml_diff>

<commit_message>
Added option to download solutions
</commit_message>
<xml_diff>
--- a/backend/controllers/output_1.docx
+++ b/backend/controllers/output_1.docx
@@ -57,7 +57,7 @@
                       <w:szCs w:val="24"/>
                       <w:u w:val="single"/>
                     </w:rPr>
-                    <w:t xml:space="preserve">CSE316</w:t>
+                    <w:t xml:space="preserve">CSE372</w:t>
                   </w:r>
                   <w:proofErr w:type="spellStart"/>
                   <w:r>
@@ -131,7 +131,7 @@
                       <w:szCs w:val="24"/>
                       <w:u w:val="single"/>
                     </w:rPr>
-                    <w:t xml:space="preserve">11/08/2024</w:t>
+                    <w:t xml:space="preserve">05/08/2024</w:t>
                   </w:r>
                   <w:proofErr w:type="spellStart"/>
                   <w:r>
@@ -205,7 +205,7 @@
                       <w:szCs w:val="24"/>
                       <w:u w:val="single"/>
                     </w:rPr>
-                    <w:t xml:space="preserve">CA3</w:t>
+                    <w:t xml:space="preserve">CA1</w:t>
                   </w:r>
                   <w:proofErr w:type="spellStart"/>
                   <w:r>
@@ -345,7 +345,7 @@
                       <w:szCs w:val="24"/>
                       <w:u w:val="single"/>
                     </w:rPr>
-                    <w:t xml:space="preserve">17/08/2024</w:t>
+                    <w:t xml:space="preserve">06/08/2024</w:t>
                   </w:r>
                   <w:proofErr w:type="spellStart"/>
                   <w:r>
@@ -419,7 +419,7 @@
                       <w:szCs w:val="24"/>
                       <w:u w:val="single"/>
                     </w:rPr>
-                    <w:t xml:space="preserve">Operating System</w:t>
+                    <w:t xml:space="preserve">UI UX Design</w:t>
                   </w:r>
                   <w:proofErr w:type="spellStart"/>
                   <w:r>
@@ -706,7 +706,7 @@
           <w:szCs w:val="24"/>
           <w:u w:val="single"/>
         </w:rPr>
-        <w:t xml:space="preserve">MCQ</w:t>
+        <w:t xml:space="preserve">Subjective</w:t>
       </w:r>
       <w:proofErr w:type="spellStart"/>
       <w:r>
@@ -1116,7 +1116,7 @@
                 <w:sz w:val="24"/>
                 <w:szCs w:val="24"/>
               </w:rPr>
-              <w:t xml:space="preserve">This is a test question.</w:t>
+              <w:t xml:space="preserve">Describe the key differences between User Interface (UI) and User Experience (UX). Provide examples to illustrate your points.</w:t>
             </w:r>
             <w:r>
               <w:rPr>
@@ -1315,7 +1315,983 @@
                 <w:sz w:val="24"/>
                 <w:szCs w:val="24"/>
               </w:rPr>
-              <w:t xml:space="preserve">5</w:t>
+              <w:t xml:space="preserve">10</w:t>
+            </w:r>
+          </w:p>
+        </w:tc>
+      </w:tr>
+      <w:tr>
+        <w:trPr>
+          <w:trHeight w:val="80"/>
+        </w:trPr>
+        <w:tc>
+          <w:tcPr>
+            <w:tcW w:w="1137" w:type="dxa"/>
+            <w:tcBorders>
+              <w:top w:val="nil"/>
+            </w:tcBorders>
+            <w:shd w:val="clear" w:color="auto" w:fill="auto"/>
+          </w:tcPr>
+          <w:p>
+            <w:pPr>
+              <w:spacing w:after="0" w:line="240" w:lineRule="auto"/>
+              <w:rPr>
+                <w:rFonts w:ascii="Times New Roman" w:hAnsi="Times New Roman"/>
+                <w:sz w:val="24"/>
+                <w:szCs w:val="24"/>
+              </w:rPr>
+            </w:pPr>
+            <w:r>
+              <w:rPr>
+                <w:rFonts w:ascii="Times New Roman" w:hAnsi="Times New Roman"/>
+                <w:sz w:val="24"/>
+                <w:szCs w:val="24"/>
+              </w:rPr>
+              <w:t/>
+            </w:r>
+          </w:p>
+        </w:tc>
+        <w:tc>
+          <w:tcPr>
+            <w:tcW w:w="5718" w:type="dxa"/>
+            <w:tcBorders>
+              <w:top w:val="nil"/>
+            </w:tcBorders>
+            <w:shd w:val="clear" w:color="auto" w:fill="auto"/>
+          </w:tcPr>
+          <w:p>
+            <w:pPr>
+              <w:spacing w:after="0" w:line="240" w:lineRule="auto"/>
+              <w:jc w:val="right"/>
+              <w:rPr>
+                <w:rFonts w:ascii="Times New Roman" w:hAnsi="Times New Roman"/>
+                <w:sz w:val="24"/>
+                <w:szCs w:val="24"/>
+              </w:rPr>
+            </w:pPr>
+          </w:p>
+        </w:tc>
+        <w:tc>
+          <w:tcPr>
+            <w:tcW w:w="2153" w:type="dxa"/>
+            <w:tcBorders>
+              <w:top w:val="nil"/>
+            </w:tcBorders>
+            <w:shd w:val="clear" w:color="auto" w:fill="auto"/>
+          </w:tcPr>
+          <w:p>
+            <w:pPr>
+              <w:spacing w:after="0" w:line="240" w:lineRule="auto"/>
+              <w:rPr>
+                <w:rFonts w:ascii="Times New Roman" w:hAnsi="Times New Roman"/>
+                <w:sz w:val="24"/>
+                <w:szCs w:val="24"/>
+              </w:rPr>
+            </w:pPr>
+          </w:p>
+        </w:tc>
+        <w:tc>
+          <w:tcPr>
+            <w:tcW w:w="1787" w:type="dxa"/>
+            <w:tcBorders>
+              <w:top w:val="nil"/>
+            </w:tcBorders>
+            <w:shd w:val="clear" w:color="auto" w:fill="auto"/>
+          </w:tcPr>
+          <w:p>
+            <w:pPr>
+              <w:spacing w:after="0" w:line="240" w:lineRule="auto"/>
+              <w:rPr>
+                <w:rFonts w:ascii="Times New Roman" w:hAnsi="Times New Roman"/>
+                <w:sz w:val="24"/>
+                <w:szCs w:val="24"/>
+              </w:rPr>
+            </w:pPr>
+          </w:p>
+        </w:tc>
+        <w:tc>
+          <w:tcPr>
+            <w:tcW w:w="2155" w:type="dxa"/>
+            <w:tcBorders>
+              <w:top w:val="nil"/>
+            </w:tcBorders>
+            <w:shd w:val="clear" w:color="auto" w:fill="auto"/>
+          </w:tcPr>
+          <w:p>
+            <w:pPr>
+              <w:spacing w:after="0" w:line="240" w:lineRule="auto"/>
+              <w:rPr>
+                <w:rFonts w:ascii="Times New Roman" w:hAnsi="Times New Roman"/>
+                <w:sz w:val="24"/>
+                <w:szCs w:val="24"/>
+              </w:rPr>
+            </w:pPr>
+          </w:p>
+        </w:tc>
+      </w:tr>
+      <w:tr>
+        <w:trPr>
+          <w:trHeight w:val="82"/>
+        </w:trPr>
+        <w:tc>
+          <w:tcPr>
+            <w:tcW w:w="1137" w:type="dxa"/>
+            <w:tcBorders>
+              <w:bottom w:val="nil"/>
+            </w:tcBorders>
+            <w:shd w:val="clear" w:color="auto" w:fill="auto"/>
+          </w:tcPr>
+          <w:p>
+            <w:pPr>
+              <w:spacing w:after="0" w:line="240" w:lineRule="auto"/>
+              <w:rPr>
+                <w:rFonts w:ascii="Times New Roman" w:hAnsi="Times New Roman"/>
+                <w:sz w:val="24"/>
+                <w:szCs w:val="24"/>
+              </w:rPr>
+            </w:pPr>
+            <w:r>
+              <w:rPr>
+                <w:rFonts w:ascii="Times New Roman" w:hAnsi="Times New Roman"/>
+                <w:sz w:val="24"/>
+                <w:szCs w:val="24"/>
+              </w:rPr>
+              <w:t/>
+            </w:r>
+          </w:p>
+        </w:tc>
+        <w:tc>
+          <w:tcPr>
+            <w:tcW w:w="5718" w:type="dxa"/>
+            <w:tcBorders>
+              <w:bottom w:val="nil"/>
+            </w:tcBorders>
+            <w:shd w:val="clear" w:color="auto" w:fill="auto"/>
+          </w:tcPr>
+          <w:p>
+            <w:pPr>
+              <w:spacing w:after="0" w:line="240" w:lineRule="auto"/>
+              <w:jc w:val="right"/>
+              <w:rPr>
+                <w:rFonts w:ascii="Times New Roman" w:hAnsi="Times New Roman"/>
+                <w:sz w:val="24"/>
+                <w:szCs w:val="24"/>
+              </w:rPr>
+            </w:pPr>
+          </w:p>
+        </w:tc>
+        <w:tc>
+          <w:tcPr>
+            <w:tcW w:w="2153" w:type="dxa"/>
+            <w:tcBorders>
+              <w:bottom w:val="nil"/>
+            </w:tcBorders>
+            <w:shd w:val="clear" w:color="auto" w:fill="auto"/>
+          </w:tcPr>
+          <w:p>
+            <w:pPr>
+              <w:spacing w:after="0" w:line="240" w:lineRule="auto"/>
+              <w:rPr>
+                <w:rFonts w:ascii="Times New Roman" w:hAnsi="Times New Roman"/>
+                <w:sz w:val="24"/>
+                <w:szCs w:val="24"/>
+              </w:rPr>
+            </w:pPr>
+          </w:p>
+        </w:tc>
+        <w:tc>
+          <w:tcPr>
+            <w:tcW w:w="1787" w:type="dxa"/>
+            <w:tcBorders>
+              <w:bottom w:val="nil"/>
+            </w:tcBorders>
+            <w:shd w:val="clear" w:color="auto" w:fill="auto"/>
+          </w:tcPr>
+          <w:p>
+            <w:pPr>
+              <w:spacing w:after="0" w:line="240" w:lineRule="auto"/>
+              <w:rPr>
+                <w:rFonts w:ascii="Times New Roman" w:hAnsi="Times New Roman"/>
+                <w:sz w:val="24"/>
+                <w:szCs w:val="24"/>
+              </w:rPr>
+            </w:pPr>
+          </w:p>
+        </w:tc>
+        <w:tc>
+          <w:tcPr>
+            <w:tcW w:w="2155" w:type="dxa"/>
+            <w:tcBorders>
+              <w:bottom w:val="nil"/>
+            </w:tcBorders>
+            <w:shd w:val="clear" w:color="auto" w:fill="auto"/>
+          </w:tcPr>
+          <w:p>
+            <w:pPr>
+              <w:spacing w:after="0" w:line="240" w:lineRule="auto"/>
+              <w:rPr>
+                <w:rFonts w:ascii="Times New Roman" w:hAnsi="Times New Roman"/>
+                <w:sz w:val="24"/>
+                <w:szCs w:val="24"/>
+              </w:rPr>
+            </w:pPr>
+          </w:p>
+        </w:tc>
+      </w:tr>
+      <w:tr>
+        <w:trPr>
+          <w:trHeight w:val="74"/>
+        </w:trPr>
+        <w:tc>
+          <w:tcPr>
+            <w:tcW w:w="1137" w:type="dxa"/>
+            <w:tcBorders>
+              <w:top w:val="nil"/>
+              <w:bottom w:val="nil"/>
+            </w:tcBorders>
+            <w:shd w:val="clear" w:color="auto" w:fill="auto"/>
+          </w:tcPr>
+          <w:p>
+            <w:pPr>
+              <w:spacing w:after="0" w:line="240" w:lineRule="auto"/>
+              <w:rPr>
+                <w:rFonts w:ascii="Times New Roman" w:hAnsi="Times New Roman"/>
+                <w:b/>
+                <w:bCs/>
+                <w:sz w:val="24"/>
+                <w:szCs w:val="24"/>
+              </w:rPr>
+            </w:pPr>
+            <w:r>
+              <w:rPr>
+                <w:rFonts w:ascii="Times New Roman" w:hAnsi="Times New Roman"/>
+                <w:b/>
+                <w:bCs/>
+                <w:sz w:val="24"/>
+                <w:szCs w:val="24"/>
+              </w:rPr>
+              <w:t xml:space="preserve">2</w:t>
+            </w:r>
+          </w:p>
+        </w:tc>
+        <w:tc>
+          <w:tcPr>
+            <w:tcW w:w="5718" w:type="dxa"/>
+            <w:tcBorders>
+              <w:top w:val="nil"/>
+              <w:bottom w:val="nil"/>
+            </w:tcBorders>
+            <w:shd w:val="clear" w:color="auto" w:fill="auto"/>
+          </w:tcPr>
+          <w:p>
+            <w:pPr>
+              <w:spacing w:after="0" w:line="240" w:lineRule="auto"/>
+              <w:rPr>
+                <w:rStyle w:val="markedcontent"/>
+                <w:rFonts w:ascii="Times New Roman" w:hAnsi="Times New Roman"/>
+                <w:b/>
+                <w:bCs/>
+                <w:sz w:val="24"/>
+                <w:szCs w:val="24"/>
+              </w:rPr>
+            </w:pPr>
+            <w:r>
+              <w:rPr>
+                <w:rStyle w:val="markedcontent"/>
+                <w:rFonts w:ascii="Times New Roman" w:hAnsi="Times New Roman"/>
+                <w:b/>
+                <w:bCs/>
+                <w:sz w:val="24"/>
+                <w:szCs w:val="24"/>
+              </w:rPr>
+              <w:t xml:space="preserve">Explain the purpose of a moodboard in design. List and describe the different elements that can be included in a moodboard, providing examples for each element.</w:t>
+            </w:r>
+            <w:r>
+              <w:rPr>
+                <w:rStyle w:val="markedcontent"/>
+                <w:rFonts w:ascii="Times New Roman" w:hAnsi="Times New Roman"/>
+                <w:b/>
+                <w:bCs/>
+                <w:sz w:val="24"/>
+                <w:szCs w:val="24"/>
+              </w:rPr>
+              <w:t xml:space="preserve"> </w:t>
+            </w:r>
+          </w:p>
+          <w:p>
+            <w:pPr>
+              <w:spacing w:after="0" w:line="240" w:lineRule="auto"/>
+              <w:jc w:val="both"/>
+              <w:rPr>
+                <w:rFonts w:ascii="Times New Roman" w:hAnsi="Times New Roman"/>
+                <w:b/>
+                <w:bCs/>
+                <w:sz w:val="24"/>
+                <w:szCs w:val="24"/>
+              </w:rPr>
+            </w:pPr>
+            <w:r>
+              <w:rPr>
+                <w:rStyle w:val="markedcontent"/>
+                <w:rFonts w:ascii="Times New Roman" w:hAnsi="Times New Roman"/>
+                <w:b/>
+                <w:bCs/>
+                <w:sz w:val="24"/>
+                <w:szCs w:val="24"/>
+              </w:rPr>
+            </w:r>
+            <w:r>
+              <w:rPr>
+                <w:rStyle w:val="markedcontent"/>
+                <w:rFonts w:ascii="Times New Roman" w:hAnsi="Times New Roman"/>
+                <w:b/>
+                <w:bCs/>
+                <w:sz w:val="24"/>
+                <w:szCs w:val="24"/>
+              </w:rPr>
+              <w:t/>
+            </w:r>
+            <w:r>
+              <w:rPr>
+                <w:rFonts w:ascii="Times New Roman" w:hAnsi="Times New Roman"/>
+                <w:b/>
+                <w:bCs/>
+                <w:sz w:val="24"/>
+                <w:szCs w:val="24"/>
+              </w:rPr>
+              <w:t xml:space="preserve"> </w:t>
+            </w:r>
+          </w:p>
+        </w:tc>
+        <w:tc>
+          <w:tcPr>
+            <w:tcW w:w="2153" w:type="dxa"/>
+            <w:tcBorders>
+              <w:top w:val="nil"/>
+              <w:bottom w:val="nil"/>
+            </w:tcBorders>
+            <w:shd w:val="clear" w:color="auto" w:fill="auto"/>
+          </w:tcPr>
+          <w:p>
+            <w:pPr>
+              <w:spacing w:after="0" w:line="240" w:lineRule="auto"/>
+              <w:rPr>
+                <w:rFonts w:ascii="Times New Roman" w:hAnsi="Times New Roman"/>
+                <w:sz w:val="24"/>
+                <w:szCs w:val="24"/>
+              </w:rPr>
+            </w:pPr>
+            <w:r>
+              <w:rPr>
+                <w:rFonts w:ascii="Times New Roman" w:hAnsi="Times New Roman"/>
+                <w:b/>
+                <w:bCs/>
+                <w:sz w:val="24"/>
+                <w:szCs w:val="24"/>
+              </w:rPr>
+              <w:t xml:space="preserve">CO2</w:t>
+            </w:r>
+            <w:proofErr w:type="spellStart"/>
+            <w:r>
+              <w:rPr>
+                <w:rFonts w:ascii="Times New Roman" w:hAnsi="Times New Roman"/>
+                <w:b/>
+                <w:bCs/>
+                <w:sz w:val="24"/>
+                <w:szCs w:val="24"/>
+              </w:rPr>
+              <w:t/>
+            </w:r>
+            <w:proofErr w:type="spellEnd"/>
+            <w:r>
+              <w:rPr>
+                <w:rFonts w:ascii="Times New Roman" w:hAnsi="Times New Roman"/>
+                <w:b/>
+                <w:bCs/>
+                <w:sz w:val="24"/>
+                <w:szCs w:val="24"/>
+              </w:rPr>
+              <w:t/>
+            </w:r>
+          </w:p>
+        </w:tc>
+        <w:tc>
+          <w:tcPr>
+            <w:tcW w:w="1787" w:type="dxa"/>
+            <w:tcBorders>
+              <w:top w:val="nil"/>
+              <w:bottom w:val="nil"/>
+            </w:tcBorders>
+            <w:shd w:val="clear" w:color="auto" w:fill="auto"/>
+          </w:tcPr>
+          <w:p>
+            <w:pPr>
+              <w:spacing w:after="0" w:line="240" w:lineRule="auto"/>
+              <w:rPr>
+                <w:rFonts w:ascii="Times New Roman" w:hAnsi="Times New Roman"/>
+                <w:b/>
+                <w:bCs/>
+                <w:sz w:val="24"/>
+                <w:szCs w:val="24"/>
+              </w:rPr>
+            </w:pPr>
+            <w:r>
+              <w:rPr>
+                <w:rFonts w:ascii="Times New Roman" w:hAnsi="Times New Roman"/>
+                <w:b/>
+                <w:bCs/>
+                <w:sz w:val="24"/>
+                <w:szCs w:val="24"/>
+              </w:rPr>
+              <w:t xml:space="preserve">L1</w:t>
+            </w:r>
+            <w:proofErr w:type="spellStart"/>
+            <w:r>
+              <w:rPr>
+                <w:rFonts w:ascii="Times New Roman" w:hAnsi="Times New Roman"/>
+                <w:b/>
+                <w:bCs/>
+                <w:sz w:val="24"/>
+                <w:szCs w:val="24"/>
+              </w:rPr>
+              <w:t/>
+            </w:r>
+            <w:proofErr w:type="spellEnd"/>
+            <w:r>
+              <w:rPr>
+                <w:rFonts w:ascii="Times New Roman" w:hAnsi="Times New Roman"/>
+                <w:b/>
+                <w:bCs/>
+                <w:sz w:val="24"/>
+                <w:szCs w:val="24"/>
+              </w:rPr>
+              <w:t/>
+            </w:r>
+          </w:p>
+        </w:tc>
+        <w:tc>
+          <w:tcPr>
+            <w:tcW w:w="2155" w:type="dxa"/>
+            <w:tcBorders>
+              <w:top w:val="nil"/>
+              <w:bottom w:val="nil"/>
+            </w:tcBorders>
+            <w:shd w:val="clear" w:color="auto" w:fill="auto"/>
+          </w:tcPr>
+          <w:p>
+            <w:pPr>
+              <w:spacing w:after="0" w:line="240" w:lineRule="auto"/>
+              <w:rPr>
+                <w:rFonts w:ascii="Times New Roman" w:hAnsi="Times New Roman"/>
+                <w:sz w:val="24"/>
+                <w:szCs w:val="24"/>
+              </w:rPr>
+            </w:pPr>
+            <w:r>
+              <w:rPr>
+                <w:rFonts w:ascii="Times New Roman" w:hAnsi="Times New Roman"/>
+                <w:sz w:val="24"/>
+                <w:szCs w:val="24"/>
+              </w:rPr>
+              <w:t xml:space="preserve">         </w:t>
+            </w:r>
+            <w:r>
+              <w:rPr>
+                <w:rFonts w:ascii="Times New Roman" w:hAnsi="Times New Roman"/>
+                <w:b/>
+                <w:bCs/>
+                <w:sz w:val="24"/>
+                <w:szCs w:val="24"/>
+              </w:rPr>
+              <w:t xml:space="preserve">10</w:t>
+            </w:r>
+          </w:p>
+        </w:tc>
+      </w:tr>
+      <w:tr>
+        <w:trPr>
+          <w:trHeight w:val="80"/>
+        </w:trPr>
+        <w:tc>
+          <w:tcPr>
+            <w:tcW w:w="1137" w:type="dxa"/>
+            <w:tcBorders>
+              <w:top w:val="nil"/>
+            </w:tcBorders>
+            <w:shd w:val="clear" w:color="auto" w:fill="auto"/>
+          </w:tcPr>
+          <w:p>
+            <w:pPr>
+              <w:spacing w:after="0" w:line="240" w:lineRule="auto"/>
+              <w:rPr>
+                <w:rFonts w:ascii="Times New Roman" w:hAnsi="Times New Roman"/>
+                <w:sz w:val="24"/>
+                <w:szCs w:val="24"/>
+              </w:rPr>
+            </w:pPr>
+            <w:r>
+              <w:rPr>
+                <w:rFonts w:ascii="Times New Roman" w:hAnsi="Times New Roman"/>
+                <w:sz w:val="24"/>
+                <w:szCs w:val="24"/>
+              </w:rPr>
+              <w:t/>
+            </w:r>
+          </w:p>
+        </w:tc>
+        <w:tc>
+          <w:tcPr>
+            <w:tcW w:w="5718" w:type="dxa"/>
+            <w:tcBorders>
+              <w:top w:val="nil"/>
+            </w:tcBorders>
+            <w:shd w:val="clear" w:color="auto" w:fill="auto"/>
+          </w:tcPr>
+          <w:p>
+            <w:pPr>
+              <w:spacing w:after="0" w:line="240" w:lineRule="auto"/>
+              <w:jc w:val="right"/>
+              <w:rPr>
+                <w:rFonts w:ascii="Times New Roman" w:hAnsi="Times New Roman"/>
+                <w:sz w:val="24"/>
+                <w:szCs w:val="24"/>
+              </w:rPr>
+            </w:pPr>
+          </w:p>
+        </w:tc>
+        <w:tc>
+          <w:tcPr>
+            <w:tcW w:w="2153" w:type="dxa"/>
+            <w:tcBorders>
+              <w:top w:val="nil"/>
+            </w:tcBorders>
+            <w:shd w:val="clear" w:color="auto" w:fill="auto"/>
+          </w:tcPr>
+          <w:p>
+            <w:pPr>
+              <w:spacing w:after="0" w:line="240" w:lineRule="auto"/>
+              <w:rPr>
+                <w:rFonts w:ascii="Times New Roman" w:hAnsi="Times New Roman"/>
+                <w:sz w:val="24"/>
+                <w:szCs w:val="24"/>
+              </w:rPr>
+            </w:pPr>
+          </w:p>
+        </w:tc>
+        <w:tc>
+          <w:tcPr>
+            <w:tcW w:w="1787" w:type="dxa"/>
+            <w:tcBorders>
+              <w:top w:val="nil"/>
+            </w:tcBorders>
+            <w:shd w:val="clear" w:color="auto" w:fill="auto"/>
+          </w:tcPr>
+          <w:p>
+            <w:pPr>
+              <w:spacing w:after="0" w:line="240" w:lineRule="auto"/>
+              <w:rPr>
+                <w:rFonts w:ascii="Times New Roman" w:hAnsi="Times New Roman"/>
+                <w:sz w:val="24"/>
+                <w:szCs w:val="24"/>
+              </w:rPr>
+            </w:pPr>
+          </w:p>
+        </w:tc>
+        <w:tc>
+          <w:tcPr>
+            <w:tcW w:w="2155" w:type="dxa"/>
+            <w:tcBorders>
+              <w:top w:val="nil"/>
+            </w:tcBorders>
+            <w:shd w:val="clear" w:color="auto" w:fill="auto"/>
+          </w:tcPr>
+          <w:p>
+            <w:pPr>
+              <w:spacing w:after="0" w:line="240" w:lineRule="auto"/>
+              <w:rPr>
+                <w:rFonts w:ascii="Times New Roman" w:hAnsi="Times New Roman"/>
+                <w:sz w:val="24"/>
+                <w:szCs w:val="24"/>
+              </w:rPr>
+            </w:pPr>
+          </w:p>
+        </w:tc>
+      </w:tr>
+      <w:tr>
+        <w:trPr>
+          <w:trHeight w:val="82"/>
+        </w:trPr>
+        <w:tc>
+          <w:tcPr>
+            <w:tcW w:w="1137" w:type="dxa"/>
+            <w:tcBorders>
+              <w:bottom w:val="nil"/>
+            </w:tcBorders>
+            <w:shd w:val="clear" w:color="auto" w:fill="auto"/>
+          </w:tcPr>
+          <w:p>
+            <w:pPr>
+              <w:spacing w:after="0" w:line="240" w:lineRule="auto"/>
+              <w:rPr>
+                <w:rFonts w:ascii="Times New Roman" w:hAnsi="Times New Roman"/>
+                <w:sz w:val="24"/>
+                <w:szCs w:val="24"/>
+              </w:rPr>
+            </w:pPr>
+            <w:r>
+              <w:rPr>
+                <w:rFonts w:ascii="Times New Roman" w:hAnsi="Times New Roman"/>
+                <w:sz w:val="24"/>
+                <w:szCs w:val="24"/>
+              </w:rPr>
+              <w:t/>
+            </w:r>
+          </w:p>
+        </w:tc>
+        <w:tc>
+          <w:tcPr>
+            <w:tcW w:w="5718" w:type="dxa"/>
+            <w:tcBorders>
+              <w:bottom w:val="nil"/>
+            </w:tcBorders>
+            <w:shd w:val="clear" w:color="auto" w:fill="auto"/>
+          </w:tcPr>
+          <w:p>
+            <w:pPr>
+              <w:spacing w:after="0" w:line="240" w:lineRule="auto"/>
+              <w:jc w:val="right"/>
+              <w:rPr>
+                <w:rFonts w:ascii="Times New Roman" w:hAnsi="Times New Roman"/>
+                <w:sz w:val="24"/>
+                <w:szCs w:val="24"/>
+              </w:rPr>
+            </w:pPr>
+          </w:p>
+        </w:tc>
+        <w:tc>
+          <w:tcPr>
+            <w:tcW w:w="2153" w:type="dxa"/>
+            <w:tcBorders>
+              <w:bottom w:val="nil"/>
+            </w:tcBorders>
+            <w:shd w:val="clear" w:color="auto" w:fill="auto"/>
+          </w:tcPr>
+          <w:p>
+            <w:pPr>
+              <w:spacing w:after="0" w:line="240" w:lineRule="auto"/>
+              <w:rPr>
+                <w:rFonts w:ascii="Times New Roman" w:hAnsi="Times New Roman"/>
+                <w:sz w:val="24"/>
+                <w:szCs w:val="24"/>
+              </w:rPr>
+            </w:pPr>
+          </w:p>
+        </w:tc>
+        <w:tc>
+          <w:tcPr>
+            <w:tcW w:w="1787" w:type="dxa"/>
+            <w:tcBorders>
+              <w:bottom w:val="nil"/>
+            </w:tcBorders>
+            <w:shd w:val="clear" w:color="auto" w:fill="auto"/>
+          </w:tcPr>
+          <w:p>
+            <w:pPr>
+              <w:spacing w:after="0" w:line="240" w:lineRule="auto"/>
+              <w:rPr>
+                <w:rFonts w:ascii="Times New Roman" w:hAnsi="Times New Roman"/>
+                <w:sz w:val="24"/>
+                <w:szCs w:val="24"/>
+              </w:rPr>
+            </w:pPr>
+          </w:p>
+        </w:tc>
+        <w:tc>
+          <w:tcPr>
+            <w:tcW w:w="2155" w:type="dxa"/>
+            <w:tcBorders>
+              <w:bottom w:val="nil"/>
+            </w:tcBorders>
+            <w:shd w:val="clear" w:color="auto" w:fill="auto"/>
+          </w:tcPr>
+          <w:p>
+            <w:pPr>
+              <w:spacing w:after="0" w:line="240" w:lineRule="auto"/>
+              <w:rPr>
+                <w:rFonts w:ascii="Times New Roman" w:hAnsi="Times New Roman"/>
+                <w:sz w:val="24"/>
+                <w:szCs w:val="24"/>
+              </w:rPr>
+            </w:pPr>
+          </w:p>
+        </w:tc>
+      </w:tr>
+      <w:tr>
+        <w:trPr>
+          <w:trHeight w:val="74"/>
+        </w:trPr>
+        <w:tc>
+          <w:tcPr>
+            <w:tcW w:w="1137" w:type="dxa"/>
+            <w:tcBorders>
+              <w:top w:val="nil"/>
+              <w:bottom w:val="nil"/>
+            </w:tcBorders>
+            <w:shd w:val="clear" w:color="auto" w:fill="auto"/>
+          </w:tcPr>
+          <w:p>
+            <w:pPr>
+              <w:spacing w:after="0" w:line="240" w:lineRule="auto"/>
+              <w:rPr>
+                <w:rFonts w:ascii="Times New Roman" w:hAnsi="Times New Roman"/>
+                <w:b/>
+                <w:bCs/>
+                <w:sz w:val="24"/>
+                <w:szCs w:val="24"/>
+              </w:rPr>
+            </w:pPr>
+            <w:r>
+              <w:rPr>
+                <w:rFonts w:ascii="Times New Roman" w:hAnsi="Times New Roman"/>
+                <w:b/>
+                <w:bCs/>
+                <w:sz w:val="24"/>
+                <w:szCs w:val="24"/>
+              </w:rPr>
+              <w:t xml:space="preserve">3</w:t>
+            </w:r>
+          </w:p>
+        </w:tc>
+        <w:tc>
+          <w:tcPr>
+            <w:tcW w:w="5718" w:type="dxa"/>
+            <w:tcBorders>
+              <w:top w:val="nil"/>
+              <w:bottom w:val="nil"/>
+            </w:tcBorders>
+            <w:shd w:val="clear" w:color="auto" w:fill="auto"/>
+          </w:tcPr>
+          <w:p>
+            <w:pPr>
+              <w:spacing w:after="0" w:line="240" w:lineRule="auto"/>
+              <w:rPr>
+                <w:rStyle w:val="markedcontent"/>
+                <w:rFonts w:ascii="Times New Roman" w:hAnsi="Times New Roman"/>
+                <w:b/>
+                <w:bCs/>
+                <w:sz w:val="24"/>
+                <w:szCs w:val="24"/>
+              </w:rPr>
+            </w:pPr>
+            <w:r>
+              <w:rPr>
+                <w:rStyle w:val="markedcontent"/>
+                <w:rFonts w:ascii="Times New Roman" w:hAnsi="Times New Roman"/>
+                <w:b/>
+                <w:bCs/>
+                <w:sz w:val="24"/>
+                <w:szCs w:val="24"/>
+              </w:rPr>
+              <w:t xml:space="preserve">Discuss the different ways color, shape, and images can be utilized in interface design to enhance user experience. Provide specific examples of how each element can be effectively applied.</w:t>
+            </w:r>
+            <w:r>
+              <w:rPr>
+                <w:rStyle w:val="markedcontent"/>
+                <w:rFonts w:ascii="Times New Roman" w:hAnsi="Times New Roman"/>
+                <w:b/>
+                <w:bCs/>
+                <w:sz w:val="24"/>
+                <w:szCs w:val="24"/>
+              </w:rPr>
+              <w:t xml:space="preserve"> </w:t>
+            </w:r>
+          </w:p>
+          <w:p>
+            <w:pPr>
+              <w:spacing w:after="0" w:line="240" w:lineRule="auto"/>
+              <w:jc w:val="both"/>
+              <w:rPr>
+                <w:rFonts w:ascii="Times New Roman" w:hAnsi="Times New Roman"/>
+                <w:b/>
+                <w:bCs/>
+                <w:sz w:val="24"/>
+                <w:szCs w:val="24"/>
+              </w:rPr>
+            </w:pPr>
+            <w:r>
+              <w:rPr>
+                <w:rStyle w:val="markedcontent"/>
+                <w:rFonts w:ascii="Times New Roman" w:hAnsi="Times New Roman"/>
+                <w:b/>
+                <w:bCs/>
+                <w:sz w:val="24"/>
+                <w:szCs w:val="24"/>
+              </w:rPr>
+            </w:r>
+            <w:r>
+              <w:rPr>
+                <w:rStyle w:val="markedcontent"/>
+                <w:rFonts w:ascii="Times New Roman" w:hAnsi="Times New Roman"/>
+                <w:b/>
+                <w:bCs/>
+                <w:sz w:val="24"/>
+                <w:szCs w:val="24"/>
+              </w:rPr>
+              <w:t/>
+            </w:r>
+            <w:r>
+              <w:rPr>
+                <w:rFonts w:ascii="Times New Roman" w:hAnsi="Times New Roman"/>
+                <w:b/>
+                <w:bCs/>
+                <w:sz w:val="24"/>
+                <w:szCs w:val="24"/>
+              </w:rPr>
+              <w:t xml:space="preserve"> </w:t>
+            </w:r>
+          </w:p>
+        </w:tc>
+        <w:tc>
+          <w:tcPr>
+            <w:tcW w:w="2153" w:type="dxa"/>
+            <w:tcBorders>
+              <w:top w:val="nil"/>
+              <w:bottom w:val="nil"/>
+            </w:tcBorders>
+            <w:shd w:val="clear" w:color="auto" w:fill="auto"/>
+          </w:tcPr>
+          <w:p>
+            <w:pPr>
+              <w:spacing w:after="0" w:line="240" w:lineRule="auto"/>
+              <w:rPr>
+                <w:rFonts w:ascii="Times New Roman" w:hAnsi="Times New Roman"/>
+                <w:sz w:val="24"/>
+                <w:szCs w:val="24"/>
+              </w:rPr>
+            </w:pPr>
+            <w:r>
+              <w:rPr>
+                <w:rFonts w:ascii="Times New Roman" w:hAnsi="Times New Roman"/>
+                <w:b/>
+                <w:bCs/>
+                <w:sz w:val="24"/>
+                <w:szCs w:val="24"/>
+              </w:rPr>
+              <w:t xml:space="preserve">CO2</w:t>
+            </w:r>
+            <w:proofErr w:type="spellStart"/>
+            <w:r>
+              <w:rPr>
+                <w:rFonts w:ascii="Times New Roman" w:hAnsi="Times New Roman"/>
+                <w:b/>
+                <w:bCs/>
+                <w:sz w:val="24"/>
+                <w:szCs w:val="24"/>
+              </w:rPr>
+              <w:t/>
+            </w:r>
+            <w:proofErr w:type="spellEnd"/>
+            <w:r>
+              <w:rPr>
+                <w:rFonts w:ascii="Times New Roman" w:hAnsi="Times New Roman"/>
+                <w:b/>
+                <w:bCs/>
+                <w:sz w:val="24"/>
+                <w:szCs w:val="24"/>
+              </w:rPr>
+              <w:t/>
+            </w:r>
+          </w:p>
+        </w:tc>
+        <w:tc>
+          <w:tcPr>
+            <w:tcW w:w="1787" w:type="dxa"/>
+            <w:tcBorders>
+              <w:top w:val="nil"/>
+              <w:bottom w:val="nil"/>
+            </w:tcBorders>
+            <w:shd w:val="clear" w:color="auto" w:fill="auto"/>
+          </w:tcPr>
+          <w:p>
+            <w:pPr>
+              <w:spacing w:after="0" w:line="240" w:lineRule="auto"/>
+              <w:rPr>
+                <w:rFonts w:ascii="Times New Roman" w:hAnsi="Times New Roman"/>
+                <w:b/>
+                <w:bCs/>
+                <w:sz w:val="24"/>
+                <w:szCs w:val="24"/>
+              </w:rPr>
+            </w:pPr>
+            <w:r>
+              <w:rPr>
+                <w:rFonts w:ascii="Times New Roman" w:hAnsi="Times New Roman"/>
+                <w:b/>
+                <w:bCs/>
+                <w:sz w:val="24"/>
+                <w:szCs w:val="24"/>
+              </w:rPr>
+              <w:t xml:space="preserve">L1</w:t>
+            </w:r>
+            <w:proofErr w:type="spellStart"/>
+            <w:r>
+              <w:rPr>
+                <w:rFonts w:ascii="Times New Roman" w:hAnsi="Times New Roman"/>
+                <w:b/>
+                <w:bCs/>
+                <w:sz w:val="24"/>
+                <w:szCs w:val="24"/>
+              </w:rPr>
+              <w:t/>
+            </w:r>
+            <w:proofErr w:type="spellEnd"/>
+            <w:r>
+              <w:rPr>
+                <w:rFonts w:ascii="Times New Roman" w:hAnsi="Times New Roman"/>
+                <w:b/>
+                <w:bCs/>
+                <w:sz w:val="24"/>
+                <w:szCs w:val="24"/>
+              </w:rPr>
+              <w:t/>
+            </w:r>
+          </w:p>
+        </w:tc>
+        <w:tc>
+          <w:tcPr>
+            <w:tcW w:w="2155" w:type="dxa"/>
+            <w:tcBorders>
+              <w:top w:val="nil"/>
+              <w:bottom w:val="nil"/>
+            </w:tcBorders>
+            <w:shd w:val="clear" w:color="auto" w:fill="auto"/>
+          </w:tcPr>
+          <w:p>
+            <w:pPr>
+              <w:spacing w:after="0" w:line="240" w:lineRule="auto"/>
+              <w:rPr>
+                <w:rFonts w:ascii="Times New Roman" w:hAnsi="Times New Roman"/>
+                <w:sz w:val="24"/>
+                <w:szCs w:val="24"/>
+              </w:rPr>
+            </w:pPr>
+            <w:r>
+              <w:rPr>
+                <w:rFonts w:ascii="Times New Roman" w:hAnsi="Times New Roman"/>
+                <w:sz w:val="24"/>
+                <w:szCs w:val="24"/>
+              </w:rPr>
+              <w:t xml:space="preserve">         </w:t>
+            </w:r>
+            <w:r>
+              <w:rPr>
+                <w:rFonts w:ascii="Times New Roman" w:hAnsi="Times New Roman"/>
+                <w:b/>
+                <w:bCs/>
+                <w:sz w:val="24"/>
+                <w:szCs w:val="24"/>
+              </w:rPr>
+              <w:t xml:space="preserve">10</w:t>
             </w:r>
           </w:p>
         </w:tc>

</xml_diff>